<commit_message>
updated figures, tables and dictionaries
</commit_message>
<xml_diff>
--- a/outputs/tables/Supp_Table2_Quality_Appraisal.docx
+++ b/outputs/tables/Supp_Table2_Quality_Appraisal.docx
@@ -3504,7 +3504,7 @@
                 <w:szCs w:val="18"/>
                 <w:color w:val="000000"/>
               </w:rPr>
-              <w:t xml:space="preserve">47 (100.0%)</w:t>
+              <w:t xml:space="preserve">46 (100.0%)</w:t>
             </w:r>
           </w:p>
         </w:tc>
@@ -3718,7 +3718,7 @@
                 <w:szCs w:val="18"/>
                 <w:color w:val="000000"/>
               </w:rPr>
-              <w:t xml:space="preserve">46 (97.9%)</w:t>
+              <w:t xml:space="preserve">45 (97.8%)</w:t>
             </w:r>
           </w:p>
         </w:tc>
@@ -3822,7 +3822,7 @@
                 <w:szCs w:val="18"/>
                 <w:color w:val="000000"/>
               </w:rPr>
-              <w:t xml:space="preserve">1 (2.1%)</w:t>
+              <w:t xml:space="preserve">1 (2.2%)</w:t>
             </w:r>
           </w:p>
         </w:tc>
@@ -3932,111 +3932,111 @@
                 <w:szCs w:val="18"/>
                 <w:color w:val="000000"/>
               </w:rPr>
-              <w:t xml:space="preserve">19 (40.4%)</w:t>
-            </w:r>
-          </w:p>
-        </w:tc>
-        <w:tc>
-          <w:tcPr>
-            <w:tcBorders>
-              <w:bottom w:val="none" w:sz="0" w:space="0" w:color="000000"/>
-              <w:top w:val="none" w:sz="0" w:space="0" w:color="000000"/>
-              <w:left w:val="none" w:sz="0" w:space="0" w:color="000000"/>
-              <w:right w:val="none" w:sz="0" w:space="0" w:color="000000"/>
-            </w:tcBorders>
-            <w:shd w:val="clear" w:color="auto" w:fill="FFFFFF"/>
-            <w:tcMar>
-              <w:top w:w="0" w:type="dxa"/>
-              <w:bottom w:w="0" w:type="dxa"/>
-              <w:left w:w="0" w:type="dxa"/>
-              <w:right w:w="0" w:type="dxa"/>
-            </w:tcMar>
-            <w:vAlign w:val="center"/>
-          </w:tcPr>
-          <w:p>
-            <w:pPr>
-              <w:jc w:val="left"/>
-              <w:pBdr>
-                <w:bottom w:val="none" w:sz="0" w:space="0" w:color="000000"/>
-                <w:top w:val="none" w:sz="0" w:space="0" w:color="000000"/>
-                <w:left w:val="none" w:sz="0" w:space="0" w:color="000000"/>
-                <w:right w:val="none" w:sz="0" w:space="0" w:color="000000"/>
-              </w:pBdr>
-              <w:spacing w:after="100" w:before="100" w:line="240"/>
-              <w:ind w:left="100" w:right="100" w:firstLine="0" w:firstLineChars="0"/>
-              <w:rPr>
-                <w:rFonts w:ascii="Arial" w:hAnsi="Arial" w:eastAsia="Arial" w:cs="Arial"/>
-                <w:i w:val="false"/>
-                <w:b w:val="false"/>
-                <w:u w:val="none"/>
-                <w:sz w:val="18"/>
-                <w:szCs w:val="18"/>
-                <w:color w:val="000000"/>
-              </w:rPr>
-            </w:pPr>
-            <w:r>
-              <w:rPr>
-                <w:rFonts w:ascii="Arial" w:hAnsi="Arial" w:eastAsia="Arial" w:cs="Arial"/>
-                <w:i w:val="false"/>
-                <w:b w:val="false"/>
-                <w:u w:val="none"/>
-                <w:sz w:val="18"/>
-                <w:szCs w:val="18"/>
-                <w:color w:val="000000"/>
-              </w:rPr>
-              <w:t xml:space="preserve">7 (14.9%)</w:t>
-            </w:r>
-          </w:p>
-        </w:tc>
-        <w:tc>
-          <w:tcPr>
-            <w:tcBorders>
-              <w:bottom w:val="none" w:sz="0" w:space="0" w:color="000000"/>
-              <w:top w:val="none" w:sz="0" w:space="0" w:color="000000"/>
-              <w:left w:val="none" w:sz="0" w:space="0" w:color="000000"/>
-              <w:right w:val="none" w:sz="0" w:space="0" w:color="000000"/>
-            </w:tcBorders>
-            <w:shd w:val="clear" w:color="auto" w:fill="FFFFFF"/>
-            <w:tcMar>
-              <w:top w:w="0" w:type="dxa"/>
-              <w:bottom w:w="0" w:type="dxa"/>
-              <w:left w:w="0" w:type="dxa"/>
-              <w:right w:w="0" w:type="dxa"/>
-            </w:tcMar>
-            <w:vAlign w:val="center"/>
-          </w:tcPr>
-          <w:p>
-            <w:pPr>
-              <w:jc w:val="left"/>
-              <w:pBdr>
-                <w:bottom w:val="none" w:sz="0" w:space="0" w:color="000000"/>
-                <w:top w:val="none" w:sz="0" w:space="0" w:color="000000"/>
-                <w:left w:val="none" w:sz="0" w:space="0" w:color="000000"/>
-                <w:right w:val="none" w:sz="0" w:space="0" w:color="000000"/>
-              </w:pBdr>
-              <w:spacing w:after="100" w:before="100" w:line="240"/>
-              <w:ind w:left="100" w:right="100" w:firstLine="0" w:firstLineChars="0"/>
-              <w:rPr>
-                <w:rFonts w:ascii="Arial" w:hAnsi="Arial" w:eastAsia="Arial" w:cs="Arial"/>
-                <w:i w:val="false"/>
-                <w:b w:val="false"/>
-                <w:u w:val="none"/>
-                <w:sz w:val="18"/>
-                <w:szCs w:val="18"/>
-                <w:color w:val="000000"/>
-              </w:rPr>
-            </w:pPr>
-            <w:r>
-              <w:rPr>
-                <w:rFonts w:ascii="Arial" w:hAnsi="Arial" w:eastAsia="Arial" w:cs="Arial"/>
-                <w:i w:val="false"/>
-                <w:b w:val="false"/>
-                <w:u w:val="none"/>
-                <w:sz w:val="18"/>
-                <w:szCs w:val="18"/>
-                <w:color w:val="000000"/>
-              </w:rPr>
-              <w:t xml:space="preserve">21 (44.7%)</w:t>
+              <w:t xml:space="preserve">18 (39.1%)</w:t>
+            </w:r>
+          </w:p>
+        </w:tc>
+        <w:tc>
+          <w:tcPr>
+            <w:tcBorders>
+              <w:bottom w:val="none" w:sz="0" w:space="0" w:color="000000"/>
+              <w:top w:val="none" w:sz="0" w:space="0" w:color="000000"/>
+              <w:left w:val="none" w:sz="0" w:space="0" w:color="000000"/>
+              <w:right w:val="none" w:sz="0" w:space="0" w:color="000000"/>
+            </w:tcBorders>
+            <w:shd w:val="clear" w:color="auto" w:fill="FFFFFF"/>
+            <w:tcMar>
+              <w:top w:w="0" w:type="dxa"/>
+              <w:bottom w:w="0" w:type="dxa"/>
+              <w:left w:w="0" w:type="dxa"/>
+              <w:right w:w="0" w:type="dxa"/>
+            </w:tcMar>
+            <w:vAlign w:val="center"/>
+          </w:tcPr>
+          <w:p>
+            <w:pPr>
+              <w:jc w:val="left"/>
+              <w:pBdr>
+                <w:bottom w:val="none" w:sz="0" w:space="0" w:color="000000"/>
+                <w:top w:val="none" w:sz="0" w:space="0" w:color="000000"/>
+                <w:left w:val="none" w:sz="0" w:space="0" w:color="000000"/>
+                <w:right w:val="none" w:sz="0" w:space="0" w:color="000000"/>
+              </w:pBdr>
+              <w:spacing w:after="100" w:before="100" w:line="240"/>
+              <w:ind w:left="100" w:right="100" w:firstLine="0" w:firstLineChars="0"/>
+              <w:rPr>
+                <w:rFonts w:ascii="Arial" w:hAnsi="Arial" w:eastAsia="Arial" w:cs="Arial"/>
+                <w:i w:val="false"/>
+                <w:b w:val="false"/>
+                <w:u w:val="none"/>
+                <w:sz w:val="18"/>
+                <w:szCs w:val="18"/>
+                <w:color w:val="000000"/>
+              </w:rPr>
+            </w:pPr>
+            <w:r>
+              <w:rPr>
+                <w:rFonts w:ascii="Arial" w:hAnsi="Arial" w:eastAsia="Arial" w:cs="Arial"/>
+                <w:i w:val="false"/>
+                <w:b w:val="false"/>
+                <w:u w:val="none"/>
+                <w:sz w:val="18"/>
+                <w:szCs w:val="18"/>
+                <w:color w:val="000000"/>
+              </w:rPr>
+              <w:t xml:space="preserve">7 (15.2%)</w:t>
+            </w:r>
+          </w:p>
+        </w:tc>
+        <w:tc>
+          <w:tcPr>
+            <w:tcBorders>
+              <w:bottom w:val="none" w:sz="0" w:space="0" w:color="000000"/>
+              <w:top w:val="none" w:sz="0" w:space="0" w:color="000000"/>
+              <w:left w:val="none" w:sz="0" w:space="0" w:color="000000"/>
+              <w:right w:val="none" w:sz="0" w:space="0" w:color="000000"/>
+            </w:tcBorders>
+            <w:shd w:val="clear" w:color="auto" w:fill="FFFFFF"/>
+            <w:tcMar>
+              <w:top w:w="0" w:type="dxa"/>
+              <w:bottom w:w="0" w:type="dxa"/>
+              <w:left w:w="0" w:type="dxa"/>
+              <w:right w:w="0" w:type="dxa"/>
+            </w:tcMar>
+            <w:vAlign w:val="center"/>
+          </w:tcPr>
+          <w:p>
+            <w:pPr>
+              <w:jc w:val="left"/>
+              <w:pBdr>
+                <w:bottom w:val="none" w:sz="0" w:space="0" w:color="000000"/>
+                <w:top w:val="none" w:sz="0" w:space="0" w:color="000000"/>
+                <w:left w:val="none" w:sz="0" w:space="0" w:color="000000"/>
+                <w:right w:val="none" w:sz="0" w:space="0" w:color="000000"/>
+              </w:pBdr>
+              <w:spacing w:after="100" w:before="100" w:line="240"/>
+              <w:ind w:left="100" w:right="100" w:firstLine="0" w:firstLineChars="0"/>
+              <w:rPr>
+                <w:rFonts w:ascii="Arial" w:hAnsi="Arial" w:eastAsia="Arial" w:cs="Arial"/>
+                <w:i w:val="false"/>
+                <w:b w:val="false"/>
+                <w:u w:val="none"/>
+                <w:sz w:val="18"/>
+                <w:szCs w:val="18"/>
+                <w:color w:val="000000"/>
+              </w:rPr>
+            </w:pPr>
+            <w:r>
+              <w:rPr>
+                <w:rFonts w:ascii="Arial" w:hAnsi="Arial" w:eastAsia="Arial" w:cs="Arial"/>
+                <w:i w:val="false"/>
+                <w:b w:val="false"/>
+                <w:u w:val="none"/>
+                <w:sz w:val="18"/>
+                <w:szCs w:val="18"/>
+                <w:color w:val="000000"/>
+              </w:rPr>
+              <w:t xml:space="preserve">21 (45.7%)</w:t>
             </w:r>
           </w:p>
         </w:tc>
@@ -4146,7 +4146,7 @@
                 <w:szCs w:val="18"/>
                 <w:color w:val="000000"/>
               </w:rPr>
-              <w:t xml:space="preserve">42 (89.4%)</w:t>
+              <w:t xml:space="preserve">41 (89.1%)</w:t>
             </w:r>
           </w:p>
         </w:tc>
@@ -4250,7 +4250,7 @@
                 <w:szCs w:val="18"/>
                 <w:color w:val="000000"/>
               </w:rPr>
-              <w:t xml:space="preserve">5 (10.6%)</w:t>
+              <w:t xml:space="preserve">5 (10.9%)</w:t>
             </w:r>
           </w:p>
         </w:tc>
@@ -4360,59 +4360,59 @@
                 <w:szCs w:val="18"/>
                 <w:color w:val="000000"/>
               </w:rPr>
-              <w:t xml:space="preserve">3 (6.4%)</w:t>
-            </w:r>
-          </w:p>
-        </w:tc>
-        <w:tc>
-          <w:tcPr>
-            <w:tcBorders>
-              <w:bottom w:val="none" w:sz="0" w:space="0" w:color="000000"/>
-              <w:top w:val="none" w:sz="0" w:space="0" w:color="000000"/>
-              <w:left w:val="none" w:sz="0" w:space="0" w:color="000000"/>
-              <w:right w:val="none" w:sz="0" w:space="0" w:color="000000"/>
-            </w:tcBorders>
-            <w:shd w:val="clear" w:color="auto" w:fill="FFFFFF"/>
-            <w:tcMar>
-              <w:top w:w="0" w:type="dxa"/>
-              <w:bottom w:w="0" w:type="dxa"/>
-              <w:left w:w="0" w:type="dxa"/>
-              <w:right w:w="0" w:type="dxa"/>
-            </w:tcMar>
-            <w:vAlign w:val="center"/>
-          </w:tcPr>
-          <w:p>
-            <w:pPr>
-              <w:jc w:val="left"/>
-              <w:pBdr>
-                <w:bottom w:val="none" w:sz="0" w:space="0" w:color="000000"/>
-                <w:top w:val="none" w:sz="0" w:space="0" w:color="000000"/>
-                <w:left w:val="none" w:sz="0" w:space="0" w:color="000000"/>
-                <w:right w:val="none" w:sz="0" w:space="0" w:color="000000"/>
-              </w:pBdr>
-              <w:spacing w:after="100" w:before="100" w:line="240"/>
-              <w:ind w:left="100" w:right="100" w:firstLine="0" w:firstLineChars="0"/>
-              <w:rPr>
-                <w:rFonts w:ascii="Arial" w:hAnsi="Arial" w:eastAsia="Arial" w:cs="Arial"/>
-                <w:i w:val="false"/>
-                <w:b w:val="false"/>
-                <w:u w:val="none"/>
-                <w:sz w:val="18"/>
-                <w:szCs w:val="18"/>
-                <w:color w:val="000000"/>
-              </w:rPr>
-            </w:pPr>
-            <w:r>
-              <w:rPr>
-                <w:rFonts w:ascii="Arial" w:hAnsi="Arial" w:eastAsia="Arial" w:cs="Arial"/>
-                <w:i w:val="false"/>
-                <w:b w:val="false"/>
-                <w:u w:val="none"/>
-                <w:sz w:val="18"/>
-                <w:szCs w:val="18"/>
-                <w:color w:val="000000"/>
-              </w:rPr>
-              <w:t xml:space="preserve">44 (93.6%)</w:t>
+              <w:t xml:space="preserve">3 (6.5%)</w:t>
+            </w:r>
+          </w:p>
+        </w:tc>
+        <w:tc>
+          <w:tcPr>
+            <w:tcBorders>
+              <w:bottom w:val="none" w:sz="0" w:space="0" w:color="000000"/>
+              <w:top w:val="none" w:sz="0" w:space="0" w:color="000000"/>
+              <w:left w:val="none" w:sz="0" w:space="0" w:color="000000"/>
+              <w:right w:val="none" w:sz="0" w:space="0" w:color="000000"/>
+            </w:tcBorders>
+            <w:shd w:val="clear" w:color="auto" w:fill="FFFFFF"/>
+            <w:tcMar>
+              <w:top w:w="0" w:type="dxa"/>
+              <w:bottom w:w="0" w:type="dxa"/>
+              <w:left w:w="0" w:type="dxa"/>
+              <w:right w:w="0" w:type="dxa"/>
+            </w:tcMar>
+            <w:vAlign w:val="center"/>
+          </w:tcPr>
+          <w:p>
+            <w:pPr>
+              <w:jc w:val="left"/>
+              <w:pBdr>
+                <w:bottom w:val="none" w:sz="0" w:space="0" w:color="000000"/>
+                <w:top w:val="none" w:sz="0" w:space="0" w:color="000000"/>
+                <w:left w:val="none" w:sz="0" w:space="0" w:color="000000"/>
+                <w:right w:val="none" w:sz="0" w:space="0" w:color="000000"/>
+              </w:pBdr>
+              <w:spacing w:after="100" w:before="100" w:line="240"/>
+              <w:ind w:left="100" w:right="100" w:firstLine="0" w:firstLineChars="0"/>
+              <w:rPr>
+                <w:rFonts w:ascii="Arial" w:hAnsi="Arial" w:eastAsia="Arial" w:cs="Arial"/>
+                <w:i w:val="false"/>
+                <w:b w:val="false"/>
+                <w:u w:val="none"/>
+                <w:sz w:val="18"/>
+                <w:szCs w:val="18"/>
+                <w:color w:val="000000"/>
+              </w:rPr>
+            </w:pPr>
+            <w:r>
+              <w:rPr>
+                <w:rFonts w:ascii="Arial" w:hAnsi="Arial" w:eastAsia="Arial" w:cs="Arial"/>
+                <w:i w:val="false"/>
+                <w:b w:val="false"/>
+                <w:u w:val="none"/>
+                <w:sz w:val="18"/>
+                <w:szCs w:val="18"/>
+                <w:color w:val="000000"/>
+              </w:rPr>
+              <w:t xml:space="preserve">43 (93.5%)</w:t>
             </w:r>
           </w:p>
         </w:tc>
@@ -4574,111 +4574,111 @@
                 <w:szCs w:val="18"/>
                 <w:color w:val="000000"/>
               </w:rPr>
-              <w:t xml:space="preserve">35 (74.5%)</w:t>
-            </w:r>
-          </w:p>
-        </w:tc>
-        <w:tc>
-          <w:tcPr>
-            <w:tcBorders>
-              <w:bottom w:val="none" w:sz="0" w:space="0" w:color="000000"/>
-              <w:top w:val="none" w:sz="0" w:space="0" w:color="000000"/>
-              <w:left w:val="none" w:sz="0" w:space="0" w:color="000000"/>
-              <w:right w:val="none" w:sz="0" w:space="0" w:color="000000"/>
-            </w:tcBorders>
-            <w:shd w:val="clear" w:color="auto" w:fill="FFFFFF"/>
-            <w:tcMar>
-              <w:top w:w="0" w:type="dxa"/>
-              <w:bottom w:w="0" w:type="dxa"/>
-              <w:left w:w="0" w:type="dxa"/>
-              <w:right w:w="0" w:type="dxa"/>
-            </w:tcMar>
-            <w:vAlign w:val="center"/>
-          </w:tcPr>
-          <w:p>
-            <w:pPr>
-              <w:jc w:val="left"/>
-              <w:pBdr>
-                <w:bottom w:val="none" w:sz="0" w:space="0" w:color="000000"/>
-                <w:top w:val="none" w:sz="0" w:space="0" w:color="000000"/>
-                <w:left w:val="none" w:sz="0" w:space="0" w:color="000000"/>
-                <w:right w:val="none" w:sz="0" w:space="0" w:color="000000"/>
-              </w:pBdr>
-              <w:spacing w:after="100" w:before="100" w:line="240"/>
-              <w:ind w:left="100" w:right="100" w:firstLine="0" w:firstLineChars="0"/>
-              <w:rPr>
-                <w:rFonts w:ascii="Arial" w:hAnsi="Arial" w:eastAsia="Arial" w:cs="Arial"/>
-                <w:i w:val="false"/>
-                <w:b w:val="false"/>
-                <w:u w:val="none"/>
-                <w:sz w:val="18"/>
-                <w:szCs w:val="18"/>
-                <w:color w:val="000000"/>
-              </w:rPr>
-            </w:pPr>
-            <w:r>
-              <w:rPr>
-                <w:rFonts w:ascii="Arial" w:hAnsi="Arial" w:eastAsia="Arial" w:cs="Arial"/>
-                <w:i w:val="false"/>
-                <w:b w:val="false"/>
-                <w:u w:val="none"/>
-                <w:sz w:val="18"/>
-                <w:szCs w:val="18"/>
-                <w:color w:val="000000"/>
-              </w:rPr>
-              <w:t xml:space="preserve">7 (14.9%)</w:t>
-            </w:r>
-          </w:p>
-        </w:tc>
-        <w:tc>
-          <w:tcPr>
-            <w:tcBorders>
-              <w:bottom w:val="none" w:sz="0" w:space="0" w:color="000000"/>
-              <w:top w:val="none" w:sz="0" w:space="0" w:color="000000"/>
-              <w:left w:val="none" w:sz="0" w:space="0" w:color="000000"/>
-              <w:right w:val="none" w:sz="0" w:space="0" w:color="000000"/>
-            </w:tcBorders>
-            <w:shd w:val="clear" w:color="auto" w:fill="FFFFFF"/>
-            <w:tcMar>
-              <w:top w:w="0" w:type="dxa"/>
-              <w:bottom w:w="0" w:type="dxa"/>
-              <w:left w:w="0" w:type="dxa"/>
-              <w:right w:w="0" w:type="dxa"/>
-            </w:tcMar>
-            <w:vAlign w:val="center"/>
-          </w:tcPr>
-          <w:p>
-            <w:pPr>
-              <w:jc w:val="left"/>
-              <w:pBdr>
-                <w:bottom w:val="none" w:sz="0" w:space="0" w:color="000000"/>
-                <w:top w:val="none" w:sz="0" w:space="0" w:color="000000"/>
-                <w:left w:val="none" w:sz="0" w:space="0" w:color="000000"/>
-                <w:right w:val="none" w:sz="0" w:space="0" w:color="000000"/>
-              </w:pBdr>
-              <w:spacing w:after="100" w:before="100" w:line="240"/>
-              <w:ind w:left="100" w:right="100" w:firstLine="0" w:firstLineChars="0"/>
-              <w:rPr>
-                <w:rFonts w:ascii="Arial" w:hAnsi="Arial" w:eastAsia="Arial" w:cs="Arial"/>
-                <w:i w:val="false"/>
-                <w:b w:val="false"/>
-                <w:u w:val="none"/>
-                <w:sz w:val="18"/>
-                <w:szCs w:val="18"/>
-                <w:color w:val="000000"/>
-              </w:rPr>
-            </w:pPr>
-            <w:r>
-              <w:rPr>
-                <w:rFonts w:ascii="Arial" w:hAnsi="Arial" w:eastAsia="Arial" w:cs="Arial"/>
-                <w:i w:val="false"/>
-                <w:b w:val="false"/>
-                <w:u w:val="none"/>
-                <w:sz w:val="18"/>
-                <w:szCs w:val="18"/>
-                <w:color w:val="000000"/>
-              </w:rPr>
-              <w:t xml:space="preserve">5 (10.6%)</w:t>
+              <w:t xml:space="preserve">35 (76.1%)</w:t>
+            </w:r>
+          </w:p>
+        </w:tc>
+        <w:tc>
+          <w:tcPr>
+            <w:tcBorders>
+              <w:bottom w:val="none" w:sz="0" w:space="0" w:color="000000"/>
+              <w:top w:val="none" w:sz="0" w:space="0" w:color="000000"/>
+              <w:left w:val="none" w:sz="0" w:space="0" w:color="000000"/>
+              <w:right w:val="none" w:sz="0" w:space="0" w:color="000000"/>
+            </w:tcBorders>
+            <w:shd w:val="clear" w:color="auto" w:fill="FFFFFF"/>
+            <w:tcMar>
+              <w:top w:w="0" w:type="dxa"/>
+              <w:bottom w:w="0" w:type="dxa"/>
+              <w:left w:w="0" w:type="dxa"/>
+              <w:right w:w="0" w:type="dxa"/>
+            </w:tcMar>
+            <w:vAlign w:val="center"/>
+          </w:tcPr>
+          <w:p>
+            <w:pPr>
+              <w:jc w:val="left"/>
+              <w:pBdr>
+                <w:bottom w:val="none" w:sz="0" w:space="0" w:color="000000"/>
+                <w:top w:val="none" w:sz="0" w:space="0" w:color="000000"/>
+                <w:left w:val="none" w:sz="0" w:space="0" w:color="000000"/>
+                <w:right w:val="none" w:sz="0" w:space="0" w:color="000000"/>
+              </w:pBdr>
+              <w:spacing w:after="100" w:before="100" w:line="240"/>
+              <w:ind w:left="100" w:right="100" w:firstLine="0" w:firstLineChars="0"/>
+              <w:rPr>
+                <w:rFonts w:ascii="Arial" w:hAnsi="Arial" w:eastAsia="Arial" w:cs="Arial"/>
+                <w:i w:val="false"/>
+                <w:b w:val="false"/>
+                <w:u w:val="none"/>
+                <w:sz w:val="18"/>
+                <w:szCs w:val="18"/>
+                <w:color w:val="000000"/>
+              </w:rPr>
+            </w:pPr>
+            <w:r>
+              <w:rPr>
+                <w:rFonts w:ascii="Arial" w:hAnsi="Arial" w:eastAsia="Arial" w:cs="Arial"/>
+                <w:i w:val="false"/>
+                <w:b w:val="false"/>
+                <w:u w:val="none"/>
+                <w:sz w:val="18"/>
+                <w:szCs w:val="18"/>
+                <w:color w:val="000000"/>
+              </w:rPr>
+              <w:t xml:space="preserve">6 (13.0%)</w:t>
+            </w:r>
+          </w:p>
+        </w:tc>
+        <w:tc>
+          <w:tcPr>
+            <w:tcBorders>
+              <w:bottom w:val="none" w:sz="0" w:space="0" w:color="000000"/>
+              <w:top w:val="none" w:sz="0" w:space="0" w:color="000000"/>
+              <w:left w:val="none" w:sz="0" w:space="0" w:color="000000"/>
+              <w:right w:val="none" w:sz="0" w:space="0" w:color="000000"/>
+            </w:tcBorders>
+            <w:shd w:val="clear" w:color="auto" w:fill="FFFFFF"/>
+            <w:tcMar>
+              <w:top w:w="0" w:type="dxa"/>
+              <w:bottom w:w="0" w:type="dxa"/>
+              <w:left w:w="0" w:type="dxa"/>
+              <w:right w:w="0" w:type="dxa"/>
+            </w:tcMar>
+            <w:vAlign w:val="center"/>
+          </w:tcPr>
+          <w:p>
+            <w:pPr>
+              <w:jc w:val="left"/>
+              <w:pBdr>
+                <w:bottom w:val="none" w:sz="0" w:space="0" w:color="000000"/>
+                <w:top w:val="none" w:sz="0" w:space="0" w:color="000000"/>
+                <w:left w:val="none" w:sz="0" w:space="0" w:color="000000"/>
+                <w:right w:val="none" w:sz="0" w:space="0" w:color="000000"/>
+              </w:pBdr>
+              <w:spacing w:after="100" w:before="100" w:line="240"/>
+              <w:ind w:left="100" w:right="100" w:firstLine="0" w:firstLineChars="0"/>
+              <w:rPr>
+                <w:rFonts w:ascii="Arial" w:hAnsi="Arial" w:eastAsia="Arial" w:cs="Arial"/>
+                <w:i w:val="false"/>
+                <w:b w:val="false"/>
+                <w:u w:val="none"/>
+                <w:sz w:val="18"/>
+                <w:szCs w:val="18"/>
+                <w:color w:val="000000"/>
+              </w:rPr>
+            </w:pPr>
+            <w:r>
+              <w:rPr>
+                <w:rFonts w:ascii="Arial" w:hAnsi="Arial" w:eastAsia="Arial" w:cs="Arial"/>
+                <w:i w:val="false"/>
+                <w:b w:val="false"/>
+                <w:u w:val="none"/>
+                <w:sz w:val="18"/>
+                <w:szCs w:val="18"/>
+                <w:color w:val="000000"/>
+              </w:rPr>
+              <w:t xml:space="preserve">5 (10.9%)</w:t>
             </w:r>
           </w:p>
         </w:tc>
@@ -4788,7 +4788,7 @@
                 <w:szCs w:val="18"/>
                 <w:color w:val="000000"/>
               </w:rPr>
-              <w:t xml:space="preserve">43 (91.5%)</w:t>
+              <w:t xml:space="preserve">42 (91.3%)</w:t>
             </w:r>
           </w:p>
         </w:tc>
@@ -5002,7 +5002,7 @@
                 <w:szCs w:val="18"/>
                 <w:color w:val="000000"/>
               </w:rPr>
-              <w:t xml:space="preserve">44 (93.6%)</w:t>
+              <w:t xml:space="preserve">43 (93.5%)</w:t>
             </w:r>
           </w:p>
         </w:tc>
@@ -5106,7 +5106,7 @@
                 <w:szCs w:val="18"/>
                 <w:color w:val="000000"/>
               </w:rPr>
-              <w:t xml:space="preserve">3 (6.4%)</w:t>
+              <w:t xml:space="preserve">3 (6.5%)</w:t>
             </w:r>
           </w:p>
         </w:tc>
@@ -5216,7 +5216,7 @@
                 <w:szCs w:val="18"/>
                 <w:color w:val="000000"/>
               </w:rPr>
-              <w:t xml:space="preserve">46 (97.9%)</w:t>
+              <w:t xml:space="preserve">45 (97.8%)</w:t>
             </w:r>
           </w:p>
         </w:tc>
@@ -5320,7 +5320,7 @@
                 <w:szCs w:val="18"/>
                 <w:color w:val="000000"/>
               </w:rPr>
-              <w:t xml:space="preserve">1 (2.1%)</w:t>
+              <w:t xml:space="preserve">1 (2.2%)</w:t>
             </w:r>
           </w:p>
         </w:tc>
@@ -5430,7 +5430,7 @@
                 <w:szCs w:val="18"/>
                 <w:color w:val="000000"/>
               </w:rPr>
-              <w:t xml:space="preserve">47 (100.0%)</w:t>
+              <w:t xml:space="preserve">46 (100.0%)</w:t>
             </w:r>
           </w:p>
         </w:tc>
@@ -5644,7 +5644,7 @@
                 <w:szCs w:val="18"/>
                 <w:color w:val="000000"/>
               </w:rPr>
-              <w:t xml:space="preserve">45 (95.7%)</w:t>
+              <w:t xml:space="preserve">44 (95.7%)</w:t>
             </w:r>
           </w:p>
         </w:tc>
@@ -5910,59 +5910,59 @@
                 <w:szCs w:val="18"/>
                 <w:color w:val="000000"/>
               </w:rPr>
-              <w:t xml:space="preserve">30 (63.8%)</w:t>
-            </w:r>
-          </w:p>
-        </w:tc>
-        <w:tc>
-          <w:tcPr>
-            <w:tcBorders>
-              <w:bottom w:val="none" w:sz="0" w:space="0" w:color="000000"/>
-              <w:top w:val="none" w:sz="0" w:space="0" w:color="000000"/>
-              <w:left w:val="none" w:sz="0" w:space="0" w:color="000000"/>
-              <w:right w:val="none" w:sz="0" w:space="0" w:color="000000"/>
-            </w:tcBorders>
-            <w:shd w:val="clear" w:color="auto" w:fill="FFFFFF"/>
-            <w:tcMar>
-              <w:top w:w="0" w:type="dxa"/>
-              <w:bottom w:w="0" w:type="dxa"/>
-              <w:left w:w="0" w:type="dxa"/>
-              <w:right w:w="0" w:type="dxa"/>
-            </w:tcMar>
-            <w:vAlign w:val="center"/>
-          </w:tcPr>
-          <w:p>
-            <w:pPr>
-              <w:jc w:val="left"/>
-              <w:pBdr>
-                <w:bottom w:val="none" w:sz="0" w:space="0" w:color="000000"/>
-                <w:top w:val="none" w:sz="0" w:space="0" w:color="000000"/>
-                <w:left w:val="none" w:sz="0" w:space="0" w:color="000000"/>
-                <w:right w:val="none" w:sz="0" w:space="0" w:color="000000"/>
-              </w:pBdr>
-              <w:spacing w:after="100" w:before="100" w:line="240"/>
-              <w:ind w:left="100" w:right="100" w:firstLine="0" w:firstLineChars="0"/>
-              <w:rPr>
-                <w:rFonts w:ascii="Arial" w:hAnsi="Arial" w:eastAsia="Arial" w:cs="Arial"/>
-                <w:i w:val="false"/>
-                <w:b w:val="false"/>
-                <w:u w:val="none"/>
-                <w:sz w:val="18"/>
-                <w:szCs w:val="18"/>
-                <w:color w:val="000000"/>
-              </w:rPr>
-            </w:pPr>
-            <w:r>
-              <w:rPr>
-                <w:rFonts w:ascii="Arial" w:hAnsi="Arial" w:eastAsia="Arial" w:cs="Arial"/>
-                <w:i w:val="false"/>
-                <w:b w:val="false"/>
-                <w:u w:val="none"/>
-                <w:sz w:val="18"/>
-                <w:szCs w:val="18"/>
-                <w:color w:val="000000"/>
-              </w:rPr>
-              <w:t xml:space="preserve">17 (36.2%)</w:t>
+              <w:t xml:space="preserve">29 (63.0%)</w:t>
+            </w:r>
+          </w:p>
+        </w:tc>
+        <w:tc>
+          <w:tcPr>
+            <w:tcBorders>
+              <w:bottom w:val="none" w:sz="0" w:space="0" w:color="000000"/>
+              <w:top w:val="none" w:sz="0" w:space="0" w:color="000000"/>
+              <w:left w:val="none" w:sz="0" w:space="0" w:color="000000"/>
+              <w:right w:val="none" w:sz="0" w:space="0" w:color="000000"/>
+            </w:tcBorders>
+            <w:shd w:val="clear" w:color="auto" w:fill="FFFFFF"/>
+            <w:tcMar>
+              <w:top w:w="0" w:type="dxa"/>
+              <w:bottom w:w="0" w:type="dxa"/>
+              <w:left w:w="0" w:type="dxa"/>
+              <w:right w:w="0" w:type="dxa"/>
+            </w:tcMar>
+            <w:vAlign w:val="center"/>
+          </w:tcPr>
+          <w:p>
+            <w:pPr>
+              <w:jc w:val="left"/>
+              <w:pBdr>
+                <w:bottom w:val="none" w:sz="0" w:space="0" w:color="000000"/>
+                <w:top w:val="none" w:sz="0" w:space="0" w:color="000000"/>
+                <w:left w:val="none" w:sz="0" w:space="0" w:color="000000"/>
+                <w:right w:val="none" w:sz="0" w:space="0" w:color="000000"/>
+              </w:pBdr>
+              <w:spacing w:after="100" w:before="100" w:line="240"/>
+              <w:ind w:left="100" w:right="100" w:firstLine="0" w:firstLineChars="0"/>
+              <w:rPr>
+                <w:rFonts w:ascii="Arial" w:hAnsi="Arial" w:eastAsia="Arial" w:cs="Arial"/>
+                <w:i w:val="false"/>
+                <w:b w:val="false"/>
+                <w:u w:val="none"/>
+                <w:sz w:val="18"/>
+                <w:szCs w:val="18"/>
+                <w:color w:val="000000"/>
+              </w:rPr>
+            </w:pPr>
+            <w:r>
+              <w:rPr>
+                <w:rFonts w:ascii="Arial" w:hAnsi="Arial" w:eastAsia="Arial" w:cs="Arial"/>
+                <w:i w:val="false"/>
+                <w:b w:val="false"/>
+                <w:u w:val="none"/>
+                <w:sz w:val="18"/>
+                <w:szCs w:val="18"/>
+                <w:color w:val="000000"/>
+              </w:rPr>
+              <w:t xml:space="preserve">17 (37.0%)</w:t>
             </w:r>
           </w:p>
         </w:tc>
@@ -6072,111 +6072,111 @@
                 <w:szCs w:val="18"/>
                 <w:color w:val="000000"/>
               </w:rPr>
-              <w:t xml:space="preserve">18 (38.3%)</w:t>
-            </w:r>
-          </w:p>
-        </w:tc>
-        <w:tc>
-          <w:tcPr>
-            <w:tcBorders>
-              <w:bottom w:val="none" w:sz="0" w:space="0" w:color="000000"/>
-              <w:top w:val="none" w:sz="0" w:space="0" w:color="000000"/>
-              <w:left w:val="none" w:sz="0" w:space="0" w:color="000000"/>
-              <w:right w:val="none" w:sz="0" w:space="0" w:color="000000"/>
-            </w:tcBorders>
-            <w:shd w:val="clear" w:color="auto" w:fill="FFFFFF"/>
-            <w:tcMar>
-              <w:top w:w="0" w:type="dxa"/>
-              <w:bottom w:w="0" w:type="dxa"/>
-              <w:left w:w="0" w:type="dxa"/>
-              <w:right w:w="0" w:type="dxa"/>
-            </w:tcMar>
-            <w:vAlign w:val="center"/>
-          </w:tcPr>
-          <w:p>
-            <w:pPr>
-              <w:jc w:val="left"/>
-              <w:pBdr>
-                <w:bottom w:val="none" w:sz="0" w:space="0" w:color="000000"/>
-                <w:top w:val="none" w:sz="0" w:space="0" w:color="000000"/>
-                <w:left w:val="none" w:sz="0" w:space="0" w:color="000000"/>
-                <w:right w:val="none" w:sz="0" w:space="0" w:color="000000"/>
-              </w:pBdr>
-              <w:spacing w:after="100" w:before="100" w:line="240"/>
-              <w:ind w:left="100" w:right="100" w:firstLine="0" w:firstLineChars="0"/>
-              <w:rPr>
-                <w:rFonts w:ascii="Arial" w:hAnsi="Arial" w:eastAsia="Arial" w:cs="Arial"/>
-                <w:i w:val="false"/>
-                <w:b w:val="false"/>
-                <w:u w:val="none"/>
-                <w:sz w:val="18"/>
-                <w:szCs w:val="18"/>
-                <w:color w:val="000000"/>
-              </w:rPr>
-            </w:pPr>
-            <w:r>
-              <w:rPr>
-                <w:rFonts w:ascii="Arial" w:hAnsi="Arial" w:eastAsia="Arial" w:cs="Arial"/>
-                <w:i w:val="false"/>
-                <w:b w:val="false"/>
-                <w:u w:val="none"/>
-                <w:sz w:val="18"/>
-                <w:szCs w:val="18"/>
-                <w:color w:val="000000"/>
-              </w:rPr>
-              <w:t xml:space="preserve">5 (10.6%)</w:t>
-            </w:r>
-          </w:p>
-        </w:tc>
-        <w:tc>
-          <w:tcPr>
-            <w:tcBorders>
-              <w:bottom w:val="none" w:sz="0" w:space="0" w:color="000000"/>
-              <w:top w:val="none" w:sz="0" w:space="0" w:color="000000"/>
-              <w:left w:val="none" w:sz="0" w:space="0" w:color="000000"/>
-              <w:right w:val="none" w:sz="0" w:space="0" w:color="000000"/>
-            </w:tcBorders>
-            <w:shd w:val="clear" w:color="auto" w:fill="FFFFFF"/>
-            <w:tcMar>
-              <w:top w:w="0" w:type="dxa"/>
-              <w:bottom w:w="0" w:type="dxa"/>
-              <w:left w:w="0" w:type="dxa"/>
-              <w:right w:w="0" w:type="dxa"/>
-            </w:tcMar>
-            <w:vAlign w:val="center"/>
-          </w:tcPr>
-          <w:p>
-            <w:pPr>
-              <w:jc w:val="left"/>
-              <w:pBdr>
-                <w:bottom w:val="none" w:sz="0" w:space="0" w:color="000000"/>
-                <w:top w:val="none" w:sz="0" w:space="0" w:color="000000"/>
-                <w:left w:val="none" w:sz="0" w:space="0" w:color="000000"/>
-                <w:right w:val="none" w:sz="0" w:space="0" w:color="000000"/>
-              </w:pBdr>
-              <w:spacing w:after="100" w:before="100" w:line="240"/>
-              <w:ind w:left="100" w:right="100" w:firstLine="0" w:firstLineChars="0"/>
-              <w:rPr>
-                <w:rFonts w:ascii="Arial" w:hAnsi="Arial" w:eastAsia="Arial" w:cs="Arial"/>
-                <w:i w:val="false"/>
-                <w:b w:val="false"/>
-                <w:u w:val="none"/>
-                <w:sz w:val="18"/>
-                <w:szCs w:val="18"/>
-                <w:color w:val="000000"/>
-              </w:rPr>
-            </w:pPr>
-            <w:r>
-              <w:rPr>
-                <w:rFonts w:ascii="Arial" w:hAnsi="Arial" w:eastAsia="Arial" w:cs="Arial"/>
-                <w:i w:val="false"/>
-                <w:b w:val="false"/>
-                <w:u w:val="none"/>
-                <w:sz w:val="18"/>
-                <w:szCs w:val="18"/>
-                <w:color w:val="000000"/>
-              </w:rPr>
-              <w:t xml:space="preserve">24 (51.1%)</w:t>
+              <w:t xml:space="preserve">18 (39.1%)</w:t>
+            </w:r>
+          </w:p>
+        </w:tc>
+        <w:tc>
+          <w:tcPr>
+            <w:tcBorders>
+              <w:bottom w:val="none" w:sz="0" w:space="0" w:color="000000"/>
+              <w:top w:val="none" w:sz="0" w:space="0" w:color="000000"/>
+              <w:left w:val="none" w:sz="0" w:space="0" w:color="000000"/>
+              <w:right w:val="none" w:sz="0" w:space="0" w:color="000000"/>
+            </w:tcBorders>
+            <w:shd w:val="clear" w:color="auto" w:fill="FFFFFF"/>
+            <w:tcMar>
+              <w:top w:w="0" w:type="dxa"/>
+              <w:bottom w:w="0" w:type="dxa"/>
+              <w:left w:w="0" w:type="dxa"/>
+              <w:right w:w="0" w:type="dxa"/>
+            </w:tcMar>
+            <w:vAlign w:val="center"/>
+          </w:tcPr>
+          <w:p>
+            <w:pPr>
+              <w:jc w:val="left"/>
+              <w:pBdr>
+                <w:bottom w:val="none" w:sz="0" w:space="0" w:color="000000"/>
+                <w:top w:val="none" w:sz="0" w:space="0" w:color="000000"/>
+                <w:left w:val="none" w:sz="0" w:space="0" w:color="000000"/>
+                <w:right w:val="none" w:sz="0" w:space="0" w:color="000000"/>
+              </w:pBdr>
+              <w:spacing w:after="100" w:before="100" w:line="240"/>
+              <w:ind w:left="100" w:right="100" w:firstLine="0" w:firstLineChars="0"/>
+              <w:rPr>
+                <w:rFonts w:ascii="Arial" w:hAnsi="Arial" w:eastAsia="Arial" w:cs="Arial"/>
+                <w:i w:val="false"/>
+                <w:b w:val="false"/>
+                <w:u w:val="none"/>
+                <w:sz w:val="18"/>
+                <w:szCs w:val="18"/>
+                <w:color w:val="000000"/>
+              </w:rPr>
+            </w:pPr>
+            <w:r>
+              <w:rPr>
+                <w:rFonts w:ascii="Arial" w:hAnsi="Arial" w:eastAsia="Arial" w:cs="Arial"/>
+                <w:i w:val="false"/>
+                <w:b w:val="false"/>
+                <w:u w:val="none"/>
+                <w:sz w:val="18"/>
+                <w:szCs w:val="18"/>
+                <w:color w:val="000000"/>
+              </w:rPr>
+              <w:t xml:space="preserve">5 (10.9%)</w:t>
+            </w:r>
+          </w:p>
+        </w:tc>
+        <w:tc>
+          <w:tcPr>
+            <w:tcBorders>
+              <w:bottom w:val="none" w:sz="0" w:space="0" w:color="000000"/>
+              <w:top w:val="none" w:sz="0" w:space="0" w:color="000000"/>
+              <w:left w:val="none" w:sz="0" w:space="0" w:color="000000"/>
+              <w:right w:val="none" w:sz="0" w:space="0" w:color="000000"/>
+            </w:tcBorders>
+            <w:shd w:val="clear" w:color="auto" w:fill="FFFFFF"/>
+            <w:tcMar>
+              <w:top w:w="0" w:type="dxa"/>
+              <w:bottom w:w="0" w:type="dxa"/>
+              <w:left w:w="0" w:type="dxa"/>
+              <w:right w:w="0" w:type="dxa"/>
+            </w:tcMar>
+            <w:vAlign w:val="center"/>
+          </w:tcPr>
+          <w:p>
+            <w:pPr>
+              <w:jc w:val="left"/>
+              <w:pBdr>
+                <w:bottom w:val="none" w:sz="0" w:space="0" w:color="000000"/>
+                <w:top w:val="none" w:sz="0" w:space="0" w:color="000000"/>
+                <w:left w:val="none" w:sz="0" w:space="0" w:color="000000"/>
+                <w:right w:val="none" w:sz="0" w:space="0" w:color="000000"/>
+              </w:pBdr>
+              <w:spacing w:after="100" w:before="100" w:line="240"/>
+              <w:ind w:left="100" w:right="100" w:firstLine="0" w:firstLineChars="0"/>
+              <w:rPr>
+                <w:rFonts w:ascii="Arial" w:hAnsi="Arial" w:eastAsia="Arial" w:cs="Arial"/>
+                <w:i w:val="false"/>
+                <w:b w:val="false"/>
+                <w:u w:val="none"/>
+                <w:sz w:val="18"/>
+                <w:szCs w:val="18"/>
+                <w:color w:val="000000"/>
+              </w:rPr>
+            </w:pPr>
+            <w:r>
+              <w:rPr>
+                <w:rFonts w:ascii="Arial" w:hAnsi="Arial" w:eastAsia="Arial" w:cs="Arial"/>
+                <w:i w:val="false"/>
+                <w:b w:val="false"/>
+                <w:u w:val="none"/>
+                <w:sz w:val="18"/>
+                <w:szCs w:val="18"/>
+                <w:color w:val="000000"/>
+              </w:rPr>
+              <w:t xml:space="preserve">23 (50.0%)</w:t>
             </w:r>
           </w:p>
         </w:tc>
@@ -6286,111 +6286,111 @@
                 <w:szCs w:val="18"/>
                 <w:color w:val="000000"/>
               </w:rPr>
-              <w:t xml:space="preserve">13 (27.7%)</w:t>
-            </w:r>
-          </w:p>
-        </w:tc>
-        <w:tc>
-          <w:tcPr>
-            <w:tcBorders>
-              <w:bottom w:val="none" w:sz="0" w:space="0" w:color="000000"/>
-              <w:top w:val="none" w:sz="0" w:space="0" w:color="000000"/>
-              <w:left w:val="none" w:sz="0" w:space="0" w:color="000000"/>
-              <w:right w:val="none" w:sz="0" w:space="0" w:color="000000"/>
-            </w:tcBorders>
-            <w:shd w:val="clear" w:color="auto" w:fill="FFFFFF"/>
-            <w:tcMar>
-              <w:top w:w="0" w:type="dxa"/>
-              <w:bottom w:w="0" w:type="dxa"/>
-              <w:left w:w="0" w:type="dxa"/>
-              <w:right w:w="0" w:type="dxa"/>
-            </w:tcMar>
-            <w:vAlign w:val="center"/>
-          </w:tcPr>
-          <w:p>
-            <w:pPr>
-              <w:jc w:val="left"/>
-              <w:pBdr>
-                <w:bottom w:val="none" w:sz="0" w:space="0" w:color="000000"/>
-                <w:top w:val="none" w:sz="0" w:space="0" w:color="000000"/>
-                <w:left w:val="none" w:sz="0" w:space="0" w:color="000000"/>
-                <w:right w:val="none" w:sz="0" w:space="0" w:color="000000"/>
-              </w:pBdr>
-              <w:spacing w:after="100" w:before="100" w:line="240"/>
-              <w:ind w:left="100" w:right="100" w:firstLine="0" w:firstLineChars="0"/>
-              <w:rPr>
-                <w:rFonts w:ascii="Arial" w:hAnsi="Arial" w:eastAsia="Arial" w:cs="Arial"/>
-                <w:i w:val="false"/>
-                <w:b w:val="false"/>
-                <w:u w:val="none"/>
-                <w:sz w:val="18"/>
-                <w:szCs w:val="18"/>
-                <w:color w:val="000000"/>
-              </w:rPr>
-            </w:pPr>
-            <w:r>
-              <w:rPr>
-                <w:rFonts w:ascii="Arial" w:hAnsi="Arial" w:eastAsia="Arial" w:cs="Arial"/>
-                <w:i w:val="false"/>
-                <w:b w:val="false"/>
-                <w:u w:val="none"/>
-                <w:sz w:val="18"/>
-                <w:szCs w:val="18"/>
-                <w:color w:val="000000"/>
-              </w:rPr>
-              <w:t xml:space="preserve">24 (51.1%)</w:t>
-            </w:r>
-          </w:p>
-        </w:tc>
-        <w:tc>
-          <w:tcPr>
-            <w:tcBorders>
-              <w:bottom w:val="none" w:sz="0" w:space="0" w:color="000000"/>
-              <w:top w:val="none" w:sz="0" w:space="0" w:color="000000"/>
-              <w:left w:val="none" w:sz="0" w:space="0" w:color="000000"/>
-              <w:right w:val="none" w:sz="0" w:space="0" w:color="000000"/>
-            </w:tcBorders>
-            <w:shd w:val="clear" w:color="auto" w:fill="FFFFFF"/>
-            <w:tcMar>
-              <w:top w:w="0" w:type="dxa"/>
-              <w:bottom w:w="0" w:type="dxa"/>
-              <w:left w:w="0" w:type="dxa"/>
-              <w:right w:w="0" w:type="dxa"/>
-            </w:tcMar>
-            <w:vAlign w:val="center"/>
-          </w:tcPr>
-          <w:p>
-            <w:pPr>
-              <w:jc w:val="left"/>
-              <w:pBdr>
-                <w:bottom w:val="none" w:sz="0" w:space="0" w:color="000000"/>
-                <w:top w:val="none" w:sz="0" w:space="0" w:color="000000"/>
-                <w:left w:val="none" w:sz="0" w:space="0" w:color="000000"/>
-                <w:right w:val="none" w:sz="0" w:space="0" w:color="000000"/>
-              </w:pBdr>
-              <w:spacing w:after="100" w:before="100" w:line="240"/>
-              <w:ind w:left="100" w:right="100" w:firstLine="0" w:firstLineChars="0"/>
-              <w:rPr>
-                <w:rFonts w:ascii="Arial" w:hAnsi="Arial" w:eastAsia="Arial" w:cs="Arial"/>
-                <w:i w:val="false"/>
-                <w:b w:val="false"/>
-                <w:u w:val="none"/>
-                <w:sz w:val="18"/>
-                <w:szCs w:val="18"/>
-                <w:color w:val="000000"/>
-              </w:rPr>
-            </w:pPr>
-            <w:r>
-              <w:rPr>
-                <w:rFonts w:ascii="Arial" w:hAnsi="Arial" w:eastAsia="Arial" w:cs="Arial"/>
-                <w:i w:val="false"/>
-                <w:b w:val="false"/>
-                <w:u w:val="none"/>
-                <w:sz w:val="18"/>
-                <w:szCs w:val="18"/>
-                <w:color w:val="000000"/>
-              </w:rPr>
-              <w:t xml:space="preserve">10 (21.3%)</w:t>
+              <w:t xml:space="preserve">12 (26.1%)</w:t>
+            </w:r>
+          </w:p>
+        </w:tc>
+        <w:tc>
+          <w:tcPr>
+            <w:tcBorders>
+              <w:bottom w:val="none" w:sz="0" w:space="0" w:color="000000"/>
+              <w:top w:val="none" w:sz="0" w:space="0" w:color="000000"/>
+              <w:left w:val="none" w:sz="0" w:space="0" w:color="000000"/>
+              <w:right w:val="none" w:sz="0" w:space="0" w:color="000000"/>
+            </w:tcBorders>
+            <w:shd w:val="clear" w:color="auto" w:fill="FFFFFF"/>
+            <w:tcMar>
+              <w:top w:w="0" w:type="dxa"/>
+              <w:bottom w:w="0" w:type="dxa"/>
+              <w:left w:w="0" w:type="dxa"/>
+              <w:right w:w="0" w:type="dxa"/>
+            </w:tcMar>
+            <w:vAlign w:val="center"/>
+          </w:tcPr>
+          <w:p>
+            <w:pPr>
+              <w:jc w:val="left"/>
+              <w:pBdr>
+                <w:bottom w:val="none" w:sz="0" w:space="0" w:color="000000"/>
+                <w:top w:val="none" w:sz="0" w:space="0" w:color="000000"/>
+                <w:left w:val="none" w:sz="0" w:space="0" w:color="000000"/>
+                <w:right w:val="none" w:sz="0" w:space="0" w:color="000000"/>
+              </w:pBdr>
+              <w:spacing w:after="100" w:before="100" w:line="240"/>
+              <w:ind w:left="100" w:right="100" w:firstLine="0" w:firstLineChars="0"/>
+              <w:rPr>
+                <w:rFonts w:ascii="Arial" w:hAnsi="Arial" w:eastAsia="Arial" w:cs="Arial"/>
+                <w:i w:val="false"/>
+                <w:b w:val="false"/>
+                <w:u w:val="none"/>
+                <w:sz w:val="18"/>
+                <w:szCs w:val="18"/>
+                <w:color w:val="000000"/>
+              </w:rPr>
+            </w:pPr>
+            <w:r>
+              <w:rPr>
+                <w:rFonts w:ascii="Arial" w:hAnsi="Arial" w:eastAsia="Arial" w:cs="Arial"/>
+                <w:i w:val="false"/>
+                <w:b w:val="false"/>
+                <w:u w:val="none"/>
+                <w:sz w:val="18"/>
+                <w:szCs w:val="18"/>
+                <w:color w:val="000000"/>
+              </w:rPr>
+              <w:t xml:space="preserve">24 (52.2%)</w:t>
+            </w:r>
+          </w:p>
+        </w:tc>
+        <w:tc>
+          <w:tcPr>
+            <w:tcBorders>
+              <w:bottom w:val="none" w:sz="0" w:space="0" w:color="000000"/>
+              <w:top w:val="none" w:sz="0" w:space="0" w:color="000000"/>
+              <w:left w:val="none" w:sz="0" w:space="0" w:color="000000"/>
+              <w:right w:val="none" w:sz="0" w:space="0" w:color="000000"/>
+            </w:tcBorders>
+            <w:shd w:val="clear" w:color="auto" w:fill="FFFFFF"/>
+            <w:tcMar>
+              <w:top w:w="0" w:type="dxa"/>
+              <w:bottom w:w="0" w:type="dxa"/>
+              <w:left w:w="0" w:type="dxa"/>
+              <w:right w:w="0" w:type="dxa"/>
+            </w:tcMar>
+            <w:vAlign w:val="center"/>
+          </w:tcPr>
+          <w:p>
+            <w:pPr>
+              <w:jc w:val="left"/>
+              <w:pBdr>
+                <w:bottom w:val="none" w:sz="0" w:space="0" w:color="000000"/>
+                <w:top w:val="none" w:sz="0" w:space="0" w:color="000000"/>
+                <w:left w:val="none" w:sz="0" w:space="0" w:color="000000"/>
+                <w:right w:val="none" w:sz="0" w:space="0" w:color="000000"/>
+              </w:pBdr>
+              <w:spacing w:after="100" w:before="100" w:line="240"/>
+              <w:ind w:left="100" w:right="100" w:firstLine="0" w:firstLineChars="0"/>
+              <w:rPr>
+                <w:rFonts w:ascii="Arial" w:hAnsi="Arial" w:eastAsia="Arial" w:cs="Arial"/>
+                <w:i w:val="false"/>
+                <w:b w:val="false"/>
+                <w:u w:val="none"/>
+                <w:sz w:val="18"/>
+                <w:szCs w:val="18"/>
+                <w:color w:val="000000"/>
+              </w:rPr>
+            </w:pPr>
+            <w:r>
+              <w:rPr>
+                <w:rFonts w:ascii="Arial" w:hAnsi="Arial" w:eastAsia="Arial" w:cs="Arial"/>
+                <w:i w:val="false"/>
+                <w:b w:val="false"/>
+                <w:u w:val="none"/>
+                <w:sz w:val="18"/>
+                <w:szCs w:val="18"/>
+                <w:color w:val="000000"/>
+              </w:rPr>
+              <w:t xml:space="preserve">10 (21.7%)</w:t>
             </w:r>
           </w:p>
         </w:tc>
@@ -6583,7 +6583,7 @@
                 <w:szCs w:val="18"/>
                 <w:color w:val="000000"/>
               </w:rPr>
-              <w:t xml:space="preserve">5 (100.0%)</w:t>
+              <w:t xml:space="preserve">4 (100.0%)</w:t>
             </w:r>
           </w:p>
         </w:tc>
@@ -6797,59 +6797,59 @@
                 <w:szCs w:val="18"/>
                 <w:color w:val="000000"/>
               </w:rPr>
-              <w:t xml:space="preserve">4 (80.0%)</w:t>
-            </w:r>
-          </w:p>
-        </w:tc>
-        <w:tc>
-          <w:tcPr>
-            <w:tcBorders>
-              <w:bottom w:val="none" w:sz="0" w:space="0" w:color="000000"/>
-              <w:top w:val="none" w:sz="0" w:space="0" w:color="000000"/>
-              <w:left w:val="none" w:sz="0" w:space="0" w:color="000000"/>
-              <w:right w:val="none" w:sz="0" w:space="0" w:color="000000"/>
-            </w:tcBorders>
-            <w:shd w:val="clear" w:color="auto" w:fill="FFFFFF"/>
-            <w:tcMar>
-              <w:top w:w="0" w:type="dxa"/>
-              <w:bottom w:w="0" w:type="dxa"/>
-              <w:left w:w="0" w:type="dxa"/>
-              <w:right w:w="0" w:type="dxa"/>
-            </w:tcMar>
-            <w:vAlign w:val="center"/>
-          </w:tcPr>
-          <w:p>
-            <w:pPr>
-              <w:jc w:val="left"/>
-              <w:pBdr>
-                <w:bottom w:val="none" w:sz="0" w:space="0" w:color="000000"/>
-                <w:top w:val="none" w:sz="0" w:space="0" w:color="000000"/>
-                <w:left w:val="none" w:sz="0" w:space="0" w:color="000000"/>
-                <w:right w:val="none" w:sz="0" w:space="0" w:color="000000"/>
-              </w:pBdr>
-              <w:spacing w:after="100" w:before="100" w:line="240"/>
-              <w:ind w:left="100" w:right="100" w:firstLine="0" w:firstLineChars="0"/>
-              <w:rPr>
-                <w:rFonts w:ascii="Arial" w:hAnsi="Arial" w:eastAsia="Arial" w:cs="Arial"/>
-                <w:i w:val="false"/>
-                <w:b w:val="false"/>
-                <w:u w:val="none"/>
-                <w:sz w:val="18"/>
-                <w:szCs w:val="18"/>
-                <w:color w:val="000000"/>
-              </w:rPr>
-            </w:pPr>
-            <w:r>
-              <w:rPr>
-                <w:rFonts w:ascii="Arial" w:hAnsi="Arial" w:eastAsia="Arial" w:cs="Arial"/>
-                <w:i w:val="false"/>
-                <w:b w:val="false"/>
-                <w:u w:val="none"/>
-                <w:sz w:val="18"/>
-                <w:szCs w:val="18"/>
-                <w:color w:val="000000"/>
-              </w:rPr>
-              <w:t xml:space="preserve">1 (20.0%)</w:t>
+              <w:t xml:space="preserve">4 (100.0%)</w:t>
+            </w:r>
+          </w:p>
+        </w:tc>
+        <w:tc>
+          <w:tcPr>
+            <w:tcBorders>
+              <w:bottom w:val="none" w:sz="0" w:space="0" w:color="000000"/>
+              <w:top w:val="none" w:sz="0" w:space="0" w:color="000000"/>
+              <w:left w:val="none" w:sz="0" w:space="0" w:color="000000"/>
+              <w:right w:val="none" w:sz="0" w:space="0" w:color="000000"/>
+            </w:tcBorders>
+            <w:shd w:val="clear" w:color="auto" w:fill="FFFFFF"/>
+            <w:tcMar>
+              <w:top w:w="0" w:type="dxa"/>
+              <w:bottom w:w="0" w:type="dxa"/>
+              <w:left w:w="0" w:type="dxa"/>
+              <w:right w:w="0" w:type="dxa"/>
+            </w:tcMar>
+            <w:vAlign w:val="center"/>
+          </w:tcPr>
+          <w:p>
+            <w:pPr>
+              <w:jc w:val="left"/>
+              <w:pBdr>
+                <w:bottom w:val="none" w:sz="0" w:space="0" w:color="000000"/>
+                <w:top w:val="none" w:sz="0" w:space="0" w:color="000000"/>
+                <w:left w:val="none" w:sz="0" w:space="0" w:color="000000"/>
+                <w:right w:val="none" w:sz="0" w:space="0" w:color="000000"/>
+              </w:pBdr>
+              <w:spacing w:after="100" w:before="100" w:line="240"/>
+              <w:ind w:left="100" w:right="100" w:firstLine="0" w:firstLineChars="0"/>
+              <w:rPr>
+                <w:rFonts w:ascii="Arial" w:hAnsi="Arial" w:eastAsia="Arial" w:cs="Arial"/>
+                <w:i w:val="false"/>
+                <w:b w:val="false"/>
+                <w:u w:val="none"/>
+                <w:sz w:val="18"/>
+                <w:szCs w:val="18"/>
+                <w:color w:val="000000"/>
+              </w:rPr>
+            </w:pPr>
+            <w:r>
+              <w:rPr>
+                <w:rFonts w:ascii="Arial" w:hAnsi="Arial" w:eastAsia="Arial" w:cs="Arial"/>
+                <w:i w:val="false"/>
+                <w:b w:val="false"/>
+                <w:u w:val="none"/>
+                <w:sz w:val="18"/>
+                <w:szCs w:val="18"/>
+                <w:color w:val="000000"/>
+              </w:rPr>
+              <w:t xml:space="preserve">0 (0.0%)</w:t>
             </w:r>
           </w:p>
         </w:tc>
@@ -7011,111 +7011,111 @@
                 <w:szCs w:val="18"/>
                 <w:color w:val="000000"/>
               </w:rPr>
-              <w:t xml:space="preserve">1 (20.0%)</w:t>
-            </w:r>
-          </w:p>
-        </w:tc>
-        <w:tc>
-          <w:tcPr>
-            <w:tcBorders>
-              <w:bottom w:val="none" w:sz="0" w:space="0" w:color="000000"/>
-              <w:top w:val="none" w:sz="0" w:space="0" w:color="000000"/>
-              <w:left w:val="none" w:sz="0" w:space="0" w:color="000000"/>
-              <w:right w:val="none" w:sz="0" w:space="0" w:color="000000"/>
-            </w:tcBorders>
-            <w:shd w:val="clear" w:color="auto" w:fill="FFFFFF"/>
-            <w:tcMar>
-              <w:top w:w="0" w:type="dxa"/>
-              <w:bottom w:w="0" w:type="dxa"/>
-              <w:left w:w="0" w:type="dxa"/>
-              <w:right w:w="0" w:type="dxa"/>
-            </w:tcMar>
-            <w:vAlign w:val="center"/>
-          </w:tcPr>
-          <w:p>
-            <w:pPr>
-              <w:jc w:val="left"/>
-              <w:pBdr>
-                <w:bottom w:val="none" w:sz="0" w:space="0" w:color="000000"/>
-                <w:top w:val="none" w:sz="0" w:space="0" w:color="000000"/>
-                <w:left w:val="none" w:sz="0" w:space="0" w:color="000000"/>
-                <w:right w:val="none" w:sz="0" w:space="0" w:color="000000"/>
-              </w:pBdr>
-              <w:spacing w:after="100" w:before="100" w:line="240"/>
-              <w:ind w:left="100" w:right="100" w:firstLine="0" w:firstLineChars="0"/>
-              <w:rPr>
-                <w:rFonts w:ascii="Arial" w:hAnsi="Arial" w:eastAsia="Arial" w:cs="Arial"/>
-                <w:i w:val="false"/>
-                <w:b w:val="false"/>
-                <w:u w:val="none"/>
-                <w:sz w:val="18"/>
-                <w:szCs w:val="18"/>
-                <w:color w:val="000000"/>
-              </w:rPr>
-            </w:pPr>
-            <w:r>
-              <w:rPr>
-                <w:rFonts w:ascii="Arial" w:hAnsi="Arial" w:eastAsia="Arial" w:cs="Arial"/>
-                <w:i w:val="false"/>
-                <w:b w:val="false"/>
-                <w:u w:val="none"/>
-                <w:sz w:val="18"/>
-                <w:szCs w:val="18"/>
-                <w:color w:val="000000"/>
-              </w:rPr>
-              <w:t xml:space="preserve">1 (20.0%)</w:t>
-            </w:r>
-          </w:p>
-        </w:tc>
-        <w:tc>
-          <w:tcPr>
-            <w:tcBorders>
-              <w:bottom w:val="none" w:sz="0" w:space="0" w:color="000000"/>
-              <w:top w:val="none" w:sz="0" w:space="0" w:color="000000"/>
-              <w:left w:val="none" w:sz="0" w:space="0" w:color="000000"/>
-              <w:right w:val="none" w:sz="0" w:space="0" w:color="000000"/>
-            </w:tcBorders>
-            <w:shd w:val="clear" w:color="auto" w:fill="FFFFFF"/>
-            <w:tcMar>
-              <w:top w:w="0" w:type="dxa"/>
-              <w:bottom w:w="0" w:type="dxa"/>
-              <w:left w:w="0" w:type="dxa"/>
-              <w:right w:w="0" w:type="dxa"/>
-            </w:tcMar>
-            <w:vAlign w:val="center"/>
-          </w:tcPr>
-          <w:p>
-            <w:pPr>
-              <w:jc w:val="left"/>
-              <w:pBdr>
-                <w:bottom w:val="none" w:sz="0" w:space="0" w:color="000000"/>
-                <w:top w:val="none" w:sz="0" w:space="0" w:color="000000"/>
-                <w:left w:val="none" w:sz="0" w:space="0" w:color="000000"/>
-                <w:right w:val="none" w:sz="0" w:space="0" w:color="000000"/>
-              </w:pBdr>
-              <w:spacing w:after="100" w:before="100" w:line="240"/>
-              <w:ind w:left="100" w:right="100" w:firstLine="0" w:firstLineChars="0"/>
-              <w:rPr>
-                <w:rFonts w:ascii="Arial" w:hAnsi="Arial" w:eastAsia="Arial" w:cs="Arial"/>
-                <w:i w:val="false"/>
-                <w:b w:val="false"/>
-                <w:u w:val="none"/>
-                <w:sz w:val="18"/>
-                <w:szCs w:val="18"/>
-                <w:color w:val="000000"/>
-              </w:rPr>
-            </w:pPr>
-            <w:r>
-              <w:rPr>
-                <w:rFonts w:ascii="Arial" w:hAnsi="Arial" w:eastAsia="Arial" w:cs="Arial"/>
-                <w:i w:val="false"/>
-                <w:b w:val="false"/>
-                <w:u w:val="none"/>
-                <w:sz w:val="18"/>
-                <w:szCs w:val="18"/>
-                <w:color w:val="000000"/>
-              </w:rPr>
-              <w:t xml:space="preserve">3 (60.0%)</w:t>
+              <w:t xml:space="preserve">1 (25.0%)</w:t>
+            </w:r>
+          </w:p>
+        </w:tc>
+        <w:tc>
+          <w:tcPr>
+            <w:tcBorders>
+              <w:bottom w:val="none" w:sz="0" w:space="0" w:color="000000"/>
+              <w:top w:val="none" w:sz="0" w:space="0" w:color="000000"/>
+              <w:left w:val="none" w:sz="0" w:space="0" w:color="000000"/>
+              <w:right w:val="none" w:sz="0" w:space="0" w:color="000000"/>
+            </w:tcBorders>
+            <w:shd w:val="clear" w:color="auto" w:fill="FFFFFF"/>
+            <w:tcMar>
+              <w:top w:w="0" w:type="dxa"/>
+              <w:bottom w:w="0" w:type="dxa"/>
+              <w:left w:w="0" w:type="dxa"/>
+              <w:right w:w="0" w:type="dxa"/>
+            </w:tcMar>
+            <w:vAlign w:val="center"/>
+          </w:tcPr>
+          <w:p>
+            <w:pPr>
+              <w:jc w:val="left"/>
+              <w:pBdr>
+                <w:bottom w:val="none" w:sz="0" w:space="0" w:color="000000"/>
+                <w:top w:val="none" w:sz="0" w:space="0" w:color="000000"/>
+                <w:left w:val="none" w:sz="0" w:space="0" w:color="000000"/>
+                <w:right w:val="none" w:sz="0" w:space="0" w:color="000000"/>
+              </w:pBdr>
+              <w:spacing w:after="100" w:before="100" w:line="240"/>
+              <w:ind w:left="100" w:right="100" w:firstLine="0" w:firstLineChars="0"/>
+              <w:rPr>
+                <w:rFonts w:ascii="Arial" w:hAnsi="Arial" w:eastAsia="Arial" w:cs="Arial"/>
+                <w:i w:val="false"/>
+                <w:b w:val="false"/>
+                <w:u w:val="none"/>
+                <w:sz w:val="18"/>
+                <w:szCs w:val="18"/>
+                <w:color w:val="000000"/>
+              </w:rPr>
+            </w:pPr>
+            <w:r>
+              <w:rPr>
+                <w:rFonts w:ascii="Arial" w:hAnsi="Arial" w:eastAsia="Arial" w:cs="Arial"/>
+                <w:i w:val="false"/>
+                <w:b w:val="false"/>
+                <w:u w:val="none"/>
+                <w:sz w:val="18"/>
+                <w:szCs w:val="18"/>
+                <w:color w:val="000000"/>
+              </w:rPr>
+              <w:t xml:space="preserve">1 (25.0%)</w:t>
+            </w:r>
+          </w:p>
+        </w:tc>
+        <w:tc>
+          <w:tcPr>
+            <w:tcBorders>
+              <w:bottom w:val="none" w:sz="0" w:space="0" w:color="000000"/>
+              <w:top w:val="none" w:sz="0" w:space="0" w:color="000000"/>
+              <w:left w:val="none" w:sz="0" w:space="0" w:color="000000"/>
+              <w:right w:val="none" w:sz="0" w:space="0" w:color="000000"/>
+            </w:tcBorders>
+            <w:shd w:val="clear" w:color="auto" w:fill="FFFFFF"/>
+            <w:tcMar>
+              <w:top w:w="0" w:type="dxa"/>
+              <w:bottom w:w="0" w:type="dxa"/>
+              <w:left w:w="0" w:type="dxa"/>
+              <w:right w:w="0" w:type="dxa"/>
+            </w:tcMar>
+            <w:vAlign w:val="center"/>
+          </w:tcPr>
+          <w:p>
+            <w:pPr>
+              <w:jc w:val="left"/>
+              <w:pBdr>
+                <w:bottom w:val="none" w:sz="0" w:space="0" w:color="000000"/>
+                <w:top w:val="none" w:sz="0" w:space="0" w:color="000000"/>
+                <w:left w:val="none" w:sz="0" w:space="0" w:color="000000"/>
+                <w:right w:val="none" w:sz="0" w:space="0" w:color="000000"/>
+              </w:pBdr>
+              <w:spacing w:after="100" w:before="100" w:line="240"/>
+              <w:ind w:left="100" w:right="100" w:firstLine="0" w:firstLineChars="0"/>
+              <w:rPr>
+                <w:rFonts w:ascii="Arial" w:hAnsi="Arial" w:eastAsia="Arial" w:cs="Arial"/>
+                <w:i w:val="false"/>
+                <w:b w:val="false"/>
+                <w:u w:val="none"/>
+                <w:sz w:val="18"/>
+                <w:szCs w:val="18"/>
+                <w:color w:val="000000"/>
+              </w:rPr>
+            </w:pPr>
+            <w:r>
+              <w:rPr>
+                <w:rFonts w:ascii="Arial" w:hAnsi="Arial" w:eastAsia="Arial" w:cs="Arial"/>
+                <w:i w:val="false"/>
+                <w:b w:val="false"/>
+                <w:u w:val="none"/>
+                <w:sz w:val="18"/>
+                <w:szCs w:val="18"/>
+                <w:color w:val="000000"/>
+              </w:rPr>
+              <w:t xml:space="preserve">2 (50.0%)</w:t>
             </w:r>
           </w:p>
         </w:tc>
@@ -7277,59 +7277,59 @@
                 <w:szCs w:val="18"/>
                 <w:color w:val="000000"/>
               </w:rPr>
-              <w:t xml:space="preserve">3 (60.0%)</w:t>
-            </w:r>
-          </w:p>
-        </w:tc>
-        <w:tc>
-          <w:tcPr>
-            <w:tcBorders>
-              <w:bottom w:val="none" w:sz="0" w:space="0" w:color="000000"/>
-              <w:top w:val="none" w:sz="0" w:space="0" w:color="000000"/>
-              <w:left w:val="none" w:sz="0" w:space="0" w:color="000000"/>
-              <w:right w:val="none" w:sz="0" w:space="0" w:color="000000"/>
-            </w:tcBorders>
-            <w:shd w:val="clear" w:color="auto" w:fill="FFFFFF"/>
-            <w:tcMar>
-              <w:top w:w="0" w:type="dxa"/>
-              <w:bottom w:w="0" w:type="dxa"/>
-              <w:left w:w="0" w:type="dxa"/>
-              <w:right w:w="0" w:type="dxa"/>
-            </w:tcMar>
-            <w:vAlign w:val="center"/>
-          </w:tcPr>
-          <w:p>
-            <w:pPr>
-              <w:jc w:val="left"/>
-              <w:pBdr>
-                <w:bottom w:val="none" w:sz="0" w:space="0" w:color="000000"/>
-                <w:top w:val="none" w:sz="0" w:space="0" w:color="000000"/>
-                <w:left w:val="none" w:sz="0" w:space="0" w:color="000000"/>
-                <w:right w:val="none" w:sz="0" w:space="0" w:color="000000"/>
-              </w:pBdr>
-              <w:spacing w:after="100" w:before="100" w:line="240"/>
-              <w:ind w:left="100" w:right="100" w:firstLine="0" w:firstLineChars="0"/>
-              <w:rPr>
-                <w:rFonts w:ascii="Arial" w:hAnsi="Arial" w:eastAsia="Arial" w:cs="Arial"/>
-                <w:i w:val="false"/>
-                <w:b w:val="false"/>
-                <w:u w:val="none"/>
-                <w:sz w:val="18"/>
-                <w:szCs w:val="18"/>
-                <w:color w:val="000000"/>
-              </w:rPr>
-            </w:pPr>
-            <w:r>
-              <w:rPr>
-                <w:rFonts w:ascii="Arial" w:hAnsi="Arial" w:eastAsia="Arial" w:cs="Arial"/>
-                <w:i w:val="false"/>
-                <w:b w:val="false"/>
-                <w:u w:val="none"/>
-                <w:sz w:val="18"/>
-                <w:szCs w:val="18"/>
-                <w:color w:val="000000"/>
-              </w:rPr>
-              <w:t xml:space="preserve">2 (40.0%)</w:t>
+              <w:t xml:space="preserve">3 (75.0%)</w:t>
+            </w:r>
+          </w:p>
+        </w:tc>
+        <w:tc>
+          <w:tcPr>
+            <w:tcBorders>
+              <w:bottom w:val="none" w:sz="0" w:space="0" w:color="000000"/>
+              <w:top w:val="none" w:sz="0" w:space="0" w:color="000000"/>
+              <w:left w:val="none" w:sz="0" w:space="0" w:color="000000"/>
+              <w:right w:val="none" w:sz="0" w:space="0" w:color="000000"/>
+            </w:tcBorders>
+            <w:shd w:val="clear" w:color="auto" w:fill="FFFFFF"/>
+            <w:tcMar>
+              <w:top w:w="0" w:type="dxa"/>
+              <w:bottom w:w="0" w:type="dxa"/>
+              <w:left w:w="0" w:type="dxa"/>
+              <w:right w:w="0" w:type="dxa"/>
+            </w:tcMar>
+            <w:vAlign w:val="center"/>
+          </w:tcPr>
+          <w:p>
+            <w:pPr>
+              <w:jc w:val="left"/>
+              <w:pBdr>
+                <w:bottom w:val="none" w:sz="0" w:space="0" w:color="000000"/>
+                <w:top w:val="none" w:sz="0" w:space="0" w:color="000000"/>
+                <w:left w:val="none" w:sz="0" w:space="0" w:color="000000"/>
+                <w:right w:val="none" w:sz="0" w:space="0" w:color="000000"/>
+              </w:pBdr>
+              <w:spacing w:after="100" w:before="100" w:line="240"/>
+              <w:ind w:left="100" w:right="100" w:firstLine="0" w:firstLineChars="0"/>
+              <w:rPr>
+                <w:rFonts w:ascii="Arial" w:hAnsi="Arial" w:eastAsia="Arial" w:cs="Arial"/>
+                <w:i w:val="false"/>
+                <w:b w:val="false"/>
+                <w:u w:val="none"/>
+                <w:sz w:val="18"/>
+                <w:szCs w:val="18"/>
+                <w:color w:val="000000"/>
+              </w:rPr>
+            </w:pPr>
+            <w:r>
+              <w:rPr>
+                <w:rFonts w:ascii="Arial" w:hAnsi="Arial" w:eastAsia="Arial" w:cs="Arial"/>
+                <w:i w:val="false"/>
+                <w:b w:val="false"/>
+                <w:u w:val="none"/>
+                <w:sz w:val="18"/>
+                <w:szCs w:val="18"/>
+                <w:color w:val="000000"/>
+              </w:rPr>
+              <w:t xml:space="preserve">1 (25.0%)</w:t>
             </w:r>
           </w:p>
         </w:tc>
@@ -7491,59 +7491,59 @@
                 <w:szCs w:val="18"/>
                 <w:color w:val="000000"/>
               </w:rPr>
-              <w:t xml:space="preserve">3 (60.0%)</w:t>
-            </w:r>
-          </w:p>
-        </w:tc>
-        <w:tc>
-          <w:tcPr>
-            <w:tcBorders>
-              <w:bottom w:val="none" w:sz="0" w:space="0" w:color="000000"/>
-              <w:top w:val="none" w:sz="0" w:space="0" w:color="000000"/>
-              <w:left w:val="none" w:sz="0" w:space="0" w:color="000000"/>
-              <w:right w:val="none" w:sz="0" w:space="0" w:color="000000"/>
-            </w:tcBorders>
-            <w:shd w:val="clear" w:color="auto" w:fill="FFFFFF"/>
-            <w:tcMar>
-              <w:top w:w="0" w:type="dxa"/>
-              <w:bottom w:w="0" w:type="dxa"/>
-              <w:left w:w="0" w:type="dxa"/>
-              <w:right w:w="0" w:type="dxa"/>
-            </w:tcMar>
-            <w:vAlign w:val="center"/>
-          </w:tcPr>
-          <w:p>
-            <w:pPr>
-              <w:jc w:val="left"/>
-              <w:pBdr>
-                <w:bottom w:val="none" w:sz="0" w:space="0" w:color="000000"/>
-                <w:top w:val="none" w:sz="0" w:space="0" w:color="000000"/>
-                <w:left w:val="none" w:sz="0" w:space="0" w:color="000000"/>
-                <w:right w:val="none" w:sz="0" w:space="0" w:color="000000"/>
-              </w:pBdr>
-              <w:spacing w:after="100" w:before="100" w:line="240"/>
-              <w:ind w:left="100" w:right="100" w:firstLine="0" w:firstLineChars="0"/>
-              <w:rPr>
-                <w:rFonts w:ascii="Arial" w:hAnsi="Arial" w:eastAsia="Arial" w:cs="Arial"/>
-                <w:i w:val="false"/>
-                <w:b w:val="false"/>
-                <w:u w:val="none"/>
-                <w:sz w:val="18"/>
-                <w:szCs w:val="18"/>
-                <w:color w:val="000000"/>
-              </w:rPr>
-            </w:pPr>
-            <w:r>
-              <w:rPr>
-                <w:rFonts w:ascii="Arial" w:hAnsi="Arial" w:eastAsia="Arial" w:cs="Arial"/>
-                <w:i w:val="false"/>
-                <w:b w:val="false"/>
-                <w:u w:val="none"/>
-                <w:sz w:val="18"/>
-                <w:szCs w:val="18"/>
-                <w:color w:val="000000"/>
-              </w:rPr>
-              <w:t xml:space="preserve">2 (40.0%)</w:t>
+              <w:t xml:space="preserve">2 (50.0%)</w:t>
+            </w:r>
+          </w:p>
+        </w:tc>
+        <w:tc>
+          <w:tcPr>
+            <w:tcBorders>
+              <w:bottom w:val="none" w:sz="0" w:space="0" w:color="000000"/>
+              <w:top w:val="none" w:sz="0" w:space="0" w:color="000000"/>
+              <w:left w:val="none" w:sz="0" w:space="0" w:color="000000"/>
+              <w:right w:val="none" w:sz="0" w:space="0" w:color="000000"/>
+            </w:tcBorders>
+            <w:shd w:val="clear" w:color="auto" w:fill="FFFFFF"/>
+            <w:tcMar>
+              <w:top w:w="0" w:type="dxa"/>
+              <w:bottom w:w="0" w:type="dxa"/>
+              <w:left w:w="0" w:type="dxa"/>
+              <w:right w:w="0" w:type="dxa"/>
+            </w:tcMar>
+            <w:vAlign w:val="center"/>
+          </w:tcPr>
+          <w:p>
+            <w:pPr>
+              <w:jc w:val="left"/>
+              <w:pBdr>
+                <w:bottom w:val="none" w:sz="0" w:space="0" w:color="000000"/>
+                <w:top w:val="none" w:sz="0" w:space="0" w:color="000000"/>
+                <w:left w:val="none" w:sz="0" w:space="0" w:color="000000"/>
+                <w:right w:val="none" w:sz="0" w:space="0" w:color="000000"/>
+              </w:pBdr>
+              <w:spacing w:after="100" w:before="100" w:line="240"/>
+              <w:ind w:left="100" w:right="100" w:firstLine="0" w:firstLineChars="0"/>
+              <w:rPr>
+                <w:rFonts w:ascii="Arial" w:hAnsi="Arial" w:eastAsia="Arial" w:cs="Arial"/>
+                <w:i w:val="false"/>
+                <w:b w:val="false"/>
+                <w:u w:val="none"/>
+                <w:sz w:val="18"/>
+                <w:szCs w:val="18"/>
+                <w:color w:val="000000"/>
+              </w:rPr>
+            </w:pPr>
+            <w:r>
+              <w:rPr>
+                <w:rFonts w:ascii="Arial" w:hAnsi="Arial" w:eastAsia="Arial" w:cs="Arial"/>
+                <w:i w:val="false"/>
+                <w:b w:val="false"/>
+                <w:u w:val="none"/>
+                <w:sz w:val="18"/>
+                <w:szCs w:val="18"/>
+                <w:color w:val="000000"/>
+              </w:rPr>
+              <w:t xml:space="preserve">2 (50.0%)</w:t>
             </w:r>
           </w:p>
         </w:tc>
@@ -7653,59 +7653,59 @@
                 <w:szCs w:val="18"/>
                 <w:color w:val="000000"/>
               </w:rPr>
-              <w:t xml:space="preserve">4 (80.0%)</w:t>
-            </w:r>
-          </w:p>
-        </w:tc>
-        <w:tc>
-          <w:tcPr>
-            <w:tcBorders>
-              <w:bottom w:val="none" w:sz="0" w:space="0" w:color="000000"/>
-              <w:top w:val="none" w:sz="0" w:space="0" w:color="000000"/>
-              <w:left w:val="none" w:sz="0" w:space="0" w:color="000000"/>
-              <w:right w:val="none" w:sz="0" w:space="0" w:color="000000"/>
-            </w:tcBorders>
-            <w:shd w:val="clear" w:color="auto" w:fill="FFFFFF"/>
-            <w:tcMar>
-              <w:top w:w="0" w:type="dxa"/>
-              <w:bottom w:w="0" w:type="dxa"/>
-              <w:left w:w="0" w:type="dxa"/>
-              <w:right w:w="0" w:type="dxa"/>
-            </w:tcMar>
-            <w:vAlign w:val="center"/>
-          </w:tcPr>
-          <w:p>
-            <w:pPr>
-              <w:jc w:val="left"/>
-              <w:pBdr>
-                <w:bottom w:val="none" w:sz="0" w:space="0" w:color="000000"/>
-                <w:top w:val="none" w:sz="0" w:space="0" w:color="000000"/>
-                <w:left w:val="none" w:sz="0" w:space="0" w:color="000000"/>
-                <w:right w:val="none" w:sz="0" w:space="0" w:color="000000"/>
-              </w:pBdr>
-              <w:spacing w:after="100" w:before="100" w:line="240"/>
-              <w:ind w:left="100" w:right="100" w:firstLine="0" w:firstLineChars="0"/>
-              <w:rPr>
-                <w:rFonts w:ascii="Arial" w:hAnsi="Arial" w:eastAsia="Arial" w:cs="Arial"/>
-                <w:i w:val="false"/>
-                <w:b w:val="false"/>
-                <w:u w:val="none"/>
-                <w:sz w:val="18"/>
-                <w:szCs w:val="18"/>
-                <w:color w:val="000000"/>
-              </w:rPr>
-            </w:pPr>
-            <w:r>
-              <w:rPr>
-                <w:rFonts w:ascii="Arial" w:hAnsi="Arial" w:eastAsia="Arial" w:cs="Arial"/>
-                <w:i w:val="false"/>
-                <w:b w:val="false"/>
-                <w:u w:val="none"/>
-                <w:sz w:val="18"/>
-                <w:szCs w:val="18"/>
-                <w:color w:val="000000"/>
-              </w:rPr>
-              <w:t xml:space="preserve">1 (20.0%)</w:t>
+              <w:t xml:space="preserve">4 (100.0%)</w:t>
+            </w:r>
+          </w:p>
+        </w:tc>
+        <w:tc>
+          <w:tcPr>
+            <w:tcBorders>
+              <w:bottom w:val="none" w:sz="0" w:space="0" w:color="000000"/>
+              <w:top w:val="none" w:sz="0" w:space="0" w:color="000000"/>
+              <w:left w:val="none" w:sz="0" w:space="0" w:color="000000"/>
+              <w:right w:val="none" w:sz="0" w:space="0" w:color="000000"/>
+            </w:tcBorders>
+            <w:shd w:val="clear" w:color="auto" w:fill="FFFFFF"/>
+            <w:tcMar>
+              <w:top w:w="0" w:type="dxa"/>
+              <w:bottom w:w="0" w:type="dxa"/>
+              <w:left w:w="0" w:type="dxa"/>
+              <w:right w:w="0" w:type="dxa"/>
+            </w:tcMar>
+            <w:vAlign w:val="center"/>
+          </w:tcPr>
+          <w:p>
+            <w:pPr>
+              <w:jc w:val="left"/>
+              <w:pBdr>
+                <w:bottom w:val="none" w:sz="0" w:space="0" w:color="000000"/>
+                <w:top w:val="none" w:sz="0" w:space="0" w:color="000000"/>
+                <w:left w:val="none" w:sz="0" w:space="0" w:color="000000"/>
+                <w:right w:val="none" w:sz="0" w:space="0" w:color="000000"/>
+              </w:pBdr>
+              <w:spacing w:after="100" w:before="100" w:line="240"/>
+              <w:ind w:left="100" w:right="100" w:firstLine="0" w:firstLineChars="0"/>
+              <w:rPr>
+                <w:rFonts w:ascii="Arial" w:hAnsi="Arial" w:eastAsia="Arial" w:cs="Arial"/>
+                <w:i w:val="false"/>
+                <w:b w:val="false"/>
+                <w:u w:val="none"/>
+                <w:sz w:val="18"/>
+                <w:szCs w:val="18"/>
+                <w:color w:val="000000"/>
+              </w:rPr>
+            </w:pPr>
+            <w:r>
+              <w:rPr>
+                <w:rFonts w:ascii="Arial" w:hAnsi="Arial" w:eastAsia="Arial" w:cs="Arial"/>
+                <w:i w:val="false"/>
+                <w:b w:val="false"/>
+                <w:u w:val="none"/>
+                <w:sz w:val="18"/>
+                <w:szCs w:val="18"/>
+                <w:color w:val="000000"/>
+              </w:rPr>
+              <w:t xml:space="preserve">0 (0.0%)</w:t>
             </w:r>
           </w:p>
         </w:tc>
@@ -7867,59 +7867,59 @@
                 <w:szCs w:val="18"/>
                 <w:color w:val="000000"/>
               </w:rPr>
-              <w:t xml:space="preserve">3 (60.0%)</w:t>
-            </w:r>
-          </w:p>
-        </w:tc>
-        <w:tc>
-          <w:tcPr>
-            <w:tcBorders>
-              <w:bottom w:val="none" w:sz="0" w:space="0" w:color="000000"/>
-              <w:top w:val="none" w:sz="0" w:space="0" w:color="000000"/>
-              <w:left w:val="none" w:sz="0" w:space="0" w:color="000000"/>
-              <w:right w:val="none" w:sz="0" w:space="0" w:color="000000"/>
-            </w:tcBorders>
-            <w:shd w:val="clear" w:color="auto" w:fill="FFFFFF"/>
-            <w:tcMar>
-              <w:top w:w="0" w:type="dxa"/>
-              <w:bottom w:w="0" w:type="dxa"/>
-              <w:left w:w="0" w:type="dxa"/>
-              <w:right w:w="0" w:type="dxa"/>
-            </w:tcMar>
-            <w:vAlign w:val="center"/>
-          </w:tcPr>
-          <w:p>
-            <w:pPr>
-              <w:jc w:val="left"/>
-              <w:pBdr>
-                <w:bottom w:val="none" w:sz="0" w:space="0" w:color="000000"/>
-                <w:top w:val="none" w:sz="0" w:space="0" w:color="000000"/>
-                <w:left w:val="none" w:sz="0" w:space="0" w:color="000000"/>
-                <w:right w:val="none" w:sz="0" w:space="0" w:color="000000"/>
-              </w:pBdr>
-              <w:spacing w:after="100" w:before="100" w:line="240"/>
-              <w:ind w:left="100" w:right="100" w:firstLine="0" w:firstLineChars="0"/>
-              <w:rPr>
-                <w:rFonts w:ascii="Arial" w:hAnsi="Arial" w:eastAsia="Arial" w:cs="Arial"/>
-                <w:i w:val="false"/>
-                <w:b w:val="false"/>
-                <w:u w:val="none"/>
-                <w:sz w:val="18"/>
-                <w:szCs w:val="18"/>
-                <w:color w:val="000000"/>
-              </w:rPr>
-            </w:pPr>
-            <w:r>
-              <w:rPr>
-                <w:rFonts w:ascii="Arial" w:hAnsi="Arial" w:eastAsia="Arial" w:cs="Arial"/>
-                <w:i w:val="false"/>
-                <w:b w:val="false"/>
-                <w:u w:val="none"/>
-                <w:sz w:val="18"/>
-                <w:szCs w:val="18"/>
-                <w:color w:val="000000"/>
-              </w:rPr>
-              <w:t xml:space="preserve">2 (40.0%)</w:t>
+              <w:t xml:space="preserve">2 (50.0%)</w:t>
+            </w:r>
+          </w:p>
+        </w:tc>
+        <w:tc>
+          <w:tcPr>
+            <w:tcBorders>
+              <w:bottom w:val="none" w:sz="0" w:space="0" w:color="000000"/>
+              <w:top w:val="none" w:sz="0" w:space="0" w:color="000000"/>
+              <w:left w:val="none" w:sz="0" w:space="0" w:color="000000"/>
+              <w:right w:val="none" w:sz="0" w:space="0" w:color="000000"/>
+            </w:tcBorders>
+            <w:shd w:val="clear" w:color="auto" w:fill="FFFFFF"/>
+            <w:tcMar>
+              <w:top w:w="0" w:type="dxa"/>
+              <w:bottom w:w="0" w:type="dxa"/>
+              <w:left w:w="0" w:type="dxa"/>
+              <w:right w:w="0" w:type="dxa"/>
+            </w:tcMar>
+            <w:vAlign w:val="center"/>
+          </w:tcPr>
+          <w:p>
+            <w:pPr>
+              <w:jc w:val="left"/>
+              <w:pBdr>
+                <w:bottom w:val="none" w:sz="0" w:space="0" w:color="000000"/>
+                <w:top w:val="none" w:sz="0" w:space="0" w:color="000000"/>
+                <w:left w:val="none" w:sz="0" w:space="0" w:color="000000"/>
+                <w:right w:val="none" w:sz="0" w:space="0" w:color="000000"/>
+              </w:pBdr>
+              <w:spacing w:after="100" w:before="100" w:line="240"/>
+              <w:ind w:left="100" w:right="100" w:firstLine="0" w:firstLineChars="0"/>
+              <w:rPr>
+                <w:rFonts w:ascii="Arial" w:hAnsi="Arial" w:eastAsia="Arial" w:cs="Arial"/>
+                <w:i w:val="false"/>
+                <w:b w:val="false"/>
+                <w:u w:val="none"/>
+                <w:sz w:val="18"/>
+                <w:szCs w:val="18"/>
+                <w:color w:val="000000"/>
+              </w:rPr>
+            </w:pPr>
+            <w:r>
+              <w:rPr>
+                <w:rFonts w:ascii="Arial" w:hAnsi="Arial" w:eastAsia="Arial" w:cs="Arial"/>
+                <w:i w:val="false"/>
+                <w:b w:val="false"/>
+                <w:u w:val="none"/>
+                <w:sz w:val="18"/>
+                <w:szCs w:val="18"/>
+                <w:color w:val="000000"/>
+              </w:rPr>
+              <w:t xml:space="preserve">2 (50.0%)</w:t>
             </w:r>
           </w:p>
         </w:tc>
@@ -8133,59 +8133,59 @@
                 <w:szCs w:val="18"/>
                 <w:color w:val="000000"/>
               </w:rPr>
-              <w:t xml:space="preserve">3 (60.0%)</w:t>
-            </w:r>
-          </w:p>
-        </w:tc>
-        <w:tc>
-          <w:tcPr>
-            <w:tcBorders>
-              <w:bottom w:val="none" w:sz="0" w:space="0" w:color="000000"/>
-              <w:top w:val="none" w:sz="0" w:space="0" w:color="000000"/>
-              <w:left w:val="none" w:sz="0" w:space="0" w:color="000000"/>
-              <w:right w:val="none" w:sz="0" w:space="0" w:color="000000"/>
-            </w:tcBorders>
-            <w:shd w:val="clear" w:color="auto" w:fill="FFFFFF"/>
-            <w:tcMar>
-              <w:top w:w="0" w:type="dxa"/>
-              <w:bottom w:w="0" w:type="dxa"/>
-              <w:left w:w="0" w:type="dxa"/>
-              <w:right w:w="0" w:type="dxa"/>
-            </w:tcMar>
-            <w:vAlign w:val="center"/>
-          </w:tcPr>
-          <w:p>
-            <w:pPr>
-              <w:jc w:val="left"/>
-              <w:pBdr>
-                <w:bottom w:val="none" w:sz="0" w:space="0" w:color="000000"/>
-                <w:top w:val="none" w:sz="0" w:space="0" w:color="000000"/>
-                <w:left w:val="none" w:sz="0" w:space="0" w:color="000000"/>
-                <w:right w:val="none" w:sz="0" w:space="0" w:color="000000"/>
-              </w:pBdr>
-              <w:spacing w:after="100" w:before="100" w:line="240"/>
-              <w:ind w:left="100" w:right="100" w:firstLine="0" w:firstLineChars="0"/>
-              <w:rPr>
-                <w:rFonts w:ascii="Arial" w:hAnsi="Arial" w:eastAsia="Arial" w:cs="Arial"/>
-                <w:i w:val="false"/>
-                <w:b w:val="false"/>
-                <w:u w:val="none"/>
-                <w:sz w:val="18"/>
-                <w:szCs w:val="18"/>
-                <w:color w:val="000000"/>
-              </w:rPr>
-            </w:pPr>
-            <w:r>
-              <w:rPr>
-                <w:rFonts w:ascii="Arial" w:hAnsi="Arial" w:eastAsia="Arial" w:cs="Arial"/>
-                <w:i w:val="false"/>
-                <w:b w:val="false"/>
-                <w:u w:val="none"/>
-                <w:sz w:val="18"/>
-                <w:szCs w:val="18"/>
-                <w:color w:val="000000"/>
-              </w:rPr>
-              <w:t xml:space="preserve">2 (40.0%)</w:t>
+              <w:t xml:space="preserve">2 (50.0%)</w:t>
+            </w:r>
+          </w:p>
+        </w:tc>
+        <w:tc>
+          <w:tcPr>
+            <w:tcBorders>
+              <w:bottom w:val="none" w:sz="0" w:space="0" w:color="000000"/>
+              <w:top w:val="none" w:sz="0" w:space="0" w:color="000000"/>
+              <w:left w:val="none" w:sz="0" w:space="0" w:color="000000"/>
+              <w:right w:val="none" w:sz="0" w:space="0" w:color="000000"/>
+            </w:tcBorders>
+            <w:shd w:val="clear" w:color="auto" w:fill="FFFFFF"/>
+            <w:tcMar>
+              <w:top w:w="0" w:type="dxa"/>
+              <w:bottom w:w="0" w:type="dxa"/>
+              <w:left w:w="0" w:type="dxa"/>
+              <w:right w:w="0" w:type="dxa"/>
+            </w:tcMar>
+            <w:vAlign w:val="center"/>
+          </w:tcPr>
+          <w:p>
+            <w:pPr>
+              <w:jc w:val="left"/>
+              <w:pBdr>
+                <w:bottom w:val="none" w:sz="0" w:space="0" w:color="000000"/>
+                <w:top w:val="none" w:sz="0" w:space="0" w:color="000000"/>
+                <w:left w:val="none" w:sz="0" w:space="0" w:color="000000"/>
+                <w:right w:val="none" w:sz="0" w:space="0" w:color="000000"/>
+              </w:pBdr>
+              <w:spacing w:after="100" w:before="100" w:line="240"/>
+              <w:ind w:left="100" w:right="100" w:firstLine="0" w:firstLineChars="0"/>
+              <w:rPr>
+                <w:rFonts w:ascii="Arial" w:hAnsi="Arial" w:eastAsia="Arial" w:cs="Arial"/>
+                <w:i w:val="false"/>
+                <w:b w:val="false"/>
+                <w:u w:val="none"/>
+                <w:sz w:val="18"/>
+                <w:szCs w:val="18"/>
+                <w:color w:val="000000"/>
+              </w:rPr>
+            </w:pPr>
+            <w:r>
+              <w:rPr>
+                <w:rFonts w:ascii="Arial" w:hAnsi="Arial" w:eastAsia="Arial" w:cs="Arial"/>
+                <w:i w:val="false"/>
+                <w:b w:val="false"/>
+                <w:u w:val="none"/>
+                <w:sz w:val="18"/>
+                <w:szCs w:val="18"/>
+                <w:color w:val="000000"/>
+              </w:rPr>
+              <w:t xml:space="preserve">2 (50.0%)</w:t>
             </w:r>
           </w:p>
         </w:tc>
@@ -8295,59 +8295,59 @@
                 <w:szCs w:val="18"/>
                 <w:color w:val="000000"/>
               </w:rPr>
-              <w:t xml:space="preserve">4 (80.0%)</w:t>
-            </w:r>
-          </w:p>
-        </w:tc>
-        <w:tc>
-          <w:tcPr>
-            <w:tcBorders>
-              <w:bottom w:val="none" w:sz="0" w:space="0" w:color="000000"/>
-              <w:top w:val="none" w:sz="0" w:space="0" w:color="000000"/>
-              <w:left w:val="none" w:sz="0" w:space="0" w:color="000000"/>
-              <w:right w:val="none" w:sz="0" w:space="0" w:color="000000"/>
-            </w:tcBorders>
-            <w:shd w:val="clear" w:color="auto" w:fill="FFFFFF"/>
-            <w:tcMar>
-              <w:top w:w="0" w:type="dxa"/>
-              <w:bottom w:w="0" w:type="dxa"/>
-              <w:left w:w="0" w:type="dxa"/>
-              <w:right w:w="0" w:type="dxa"/>
-            </w:tcMar>
-            <w:vAlign w:val="center"/>
-          </w:tcPr>
-          <w:p>
-            <w:pPr>
-              <w:jc w:val="left"/>
-              <w:pBdr>
-                <w:bottom w:val="none" w:sz="0" w:space="0" w:color="000000"/>
-                <w:top w:val="none" w:sz="0" w:space="0" w:color="000000"/>
-                <w:left w:val="none" w:sz="0" w:space="0" w:color="000000"/>
-                <w:right w:val="none" w:sz="0" w:space="0" w:color="000000"/>
-              </w:pBdr>
-              <w:spacing w:after="100" w:before="100" w:line="240"/>
-              <w:ind w:left="100" w:right="100" w:firstLine="0" w:firstLineChars="0"/>
-              <w:rPr>
-                <w:rFonts w:ascii="Arial" w:hAnsi="Arial" w:eastAsia="Arial" w:cs="Arial"/>
-                <w:i w:val="false"/>
-                <w:b w:val="false"/>
-                <w:u w:val="none"/>
-                <w:sz w:val="18"/>
-                <w:szCs w:val="18"/>
-                <w:color w:val="000000"/>
-              </w:rPr>
-            </w:pPr>
-            <w:r>
-              <w:rPr>
-                <w:rFonts w:ascii="Arial" w:hAnsi="Arial" w:eastAsia="Arial" w:cs="Arial"/>
-                <w:i w:val="false"/>
-                <w:b w:val="false"/>
-                <w:u w:val="none"/>
-                <w:sz w:val="18"/>
-                <w:szCs w:val="18"/>
-                <w:color w:val="000000"/>
-              </w:rPr>
-              <w:t xml:space="preserve">1 (20.0%)</w:t>
+              <w:t xml:space="preserve">3 (75.0%)</w:t>
+            </w:r>
+          </w:p>
+        </w:tc>
+        <w:tc>
+          <w:tcPr>
+            <w:tcBorders>
+              <w:bottom w:val="none" w:sz="0" w:space="0" w:color="000000"/>
+              <w:top w:val="none" w:sz="0" w:space="0" w:color="000000"/>
+              <w:left w:val="none" w:sz="0" w:space="0" w:color="000000"/>
+              <w:right w:val="none" w:sz="0" w:space="0" w:color="000000"/>
+            </w:tcBorders>
+            <w:shd w:val="clear" w:color="auto" w:fill="FFFFFF"/>
+            <w:tcMar>
+              <w:top w:w="0" w:type="dxa"/>
+              <w:bottom w:w="0" w:type="dxa"/>
+              <w:left w:w="0" w:type="dxa"/>
+              <w:right w:w="0" w:type="dxa"/>
+            </w:tcMar>
+            <w:vAlign w:val="center"/>
+          </w:tcPr>
+          <w:p>
+            <w:pPr>
+              <w:jc w:val="left"/>
+              <w:pBdr>
+                <w:bottom w:val="none" w:sz="0" w:space="0" w:color="000000"/>
+                <w:top w:val="none" w:sz="0" w:space="0" w:color="000000"/>
+                <w:left w:val="none" w:sz="0" w:space="0" w:color="000000"/>
+                <w:right w:val="none" w:sz="0" w:space="0" w:color="000000"/>
+              </w:pBdr>
+              <w:spacing w:after="100" w:before="100" w:line="240"/>
+              <w:ind w:left="100" w:right="100" w:firstLine="0" w:firstLineChars="0"/>
+              <w:rPr>
+                <w:rFonts w:ascii="Arial" w:hAnsi="Arial" w:eastAsia="Arial" w:cs="Arial"/>
+                <w:i w:val="false"/>
+                <w:b w:val="false"/>
+                <w:u w:val="none"/>
+                <w:sz w:val="18"/>
+                <w:szCs w:val="18"/>
+                <w:color w:val="000000"/>
+              </w:rPr>
+            </w:pPr>
+            <w:r>
+              <w:rPr>
+                <w:rFonts w:ascii="Arial" w:hAnsi="Arial" w:eastAsia="Arial" w:cs="Arial"/>
+                <w:i w:val="false"/>
+                <w:b w:val="false"/>
+                <w:u w:val="none"/>
+                <w:sz w:val="18"/>
+                <w:szCs w:val="18"/>
+                <w:color w:val="000000"/>
+              </w:rPr>
+              <w:t xml:space="preserve">1 (25.0%)</w:t>
             </w:r>
           </w:p>
         </w:tc>
@@ -8509,59 +8509,59 @@
                 <w:szCs w:val="18"/>
                 <w:color w:val="000000"/>
               </w:rPr>
-              <w:t xml:space="preserve">3 (60.0%)</w:t>
-            </w:r>
-          </w:p>
-        </w:tc>
-        <w:tc>
-          <w:tcPr>
-            <w:tcBorders>
-              <w:bottom w:val="none" w:sz="0" w:space="0" w:color="000000"/>
-              <w:top w:val="none" w:sz="0" w:space="0" w:color="000000"/>
-              <w:left w:val="none" w:sz="0" w:space="0" w:color="000000"/>
-              <w:right w:val="none" w:sz="0" w:space="0" w:color="000000"/>
-            </w:tcBorders>
-            <w:shd w:val="clear" w:color="auto" w:fill="FFFFFF"/>
-            <w:tcMar>
-              <w:top w:w="0" w:type="dxa"/>
-              <w:bottom w:w="0" w:type="dxa"/>
-              <w:left w:w="0" w:type="dxa"/>
-              <w:right w:w="0" w:type="dxa"/>
-            </w:tcMar>
-            <w:vAlign w:val="center"/>
-          </w:tcPr>
-          <w:p>
-            <w:pPr>
-              <w:jc w:val="left"/>
-              <w:pBdr>
-                <w:bottom w:val="none" w:sz="0" w:space="0" w:color="000000"/>
-                <w:top w:val="none" w:sz="0" w:space="0" w:color="000000"/>
-                <w:left w:val="none" w:sz="0" w:space="0" w:color="000000"/>
-                <w:right w:val="none" w:sz="0" w:space="0" w:color="000000"/>
-              </w:pBdr>
-              <w:spacing w:after="100" w:before="100" w:line="240"/>
-              <w:ind w:left="100" w:right="100" w:firstLine="0" w:firstLineChars="0"/>
-              <w:rPr>
-                <w:rFonts w:ascii="Arial" w:hAnsi="Arial" w:eastAsia="Arial" w:cs="Arial"/>
-                <w:i w:val="false"/>
-                <w:b w:val="false"/>
-                <w:u w:val="none"/>
-                <w:sz w:val="18"/>
-                <w:szCs w:val="18"/>
-                <w:color w:val="000000"/>
-              </w:rPr>
-            </w:pPr>
-            <w:r>
-              <w:rPr>
-                <w:rFonts w:ascii="Arial" w:hAnsi="Arial" w:eastAsia="Arial" w:cs="Arial"/>
-                <w:i w:val="false"/>
-                <w:b w:val="false"/>
-                <w:u w:val="none"/>
-                <w:sz w:val="18"/>
-                <w:szCs w:val="18"/>
-                <w:color w:val="000000"/>
-              </w:rPr>
-              <w:t xml:space="preserve">2 (40.0%)</w:t>
+              <w:t xml:space="preserve">3 (75.0%)</w:t>
+            </w:r>
+          </w:p>
+        </w:tc>
+        <w:tc>
+          <w:tcPr>
+            <w:tcBorders>
+              <w:bottom w:val="none" w:sz="0" w:space="0" w:color="000000"/>
+              <w:top w:val="none" w:sz="0" w:space="0" w:color="000000"/>
+              <w:left w:val="none" w:sz="0" w:space="0" w:color="000000"/>
+              <w:right w:val="none" w:sz="0" w:space="0" w:color="000000"/>
+            </w:tcBorders>
+            <w:shd w:val="clear" w:color="auto" w:fill="FFFFFF"/>
+            <w:tcMar>
+              <w:top w:w="0" w:type="dxa"/>
+              <w:bottom w:w="0" w:type="dxa"/>
+              <w:left w:w="0" w:type="dxa"/>
+              <w:right w:w="0" w:type="dxa"/>
+            </w:tcMar>
+            <w:vAlign w:val="center"/>
+          </w:tcPr>
+          <w:p>
+            <w:pPr>
+              <w:jc w:val="left"/>
+              <w:pBdr>
+                <w:bottom w:val="none" w:sz="0" w:space="0" w:color="000000"/>
+                <w:top w:val="none" w:sz="0" w:space="0" w:color="000000"/>
+                <w:left w:val="none" w:sz="0" w:space="0" w:color="000000"/>
+                <w:right w:val="none" w:sz="0" w:space="0" w:color="000000"/>
+              </w:pBdr>
+              <w:spacing w:after="100" w:before="100" w:line="240"/>
+              <w:ind w:left="100" w:right="100" w:firstLine="0" w:firstLineChars="0"/>
+              <w:rPr>
+                <w:rFonts w:ascii="Arial" w:hAnsi="Arial" w:eastAsia="Arial" w:cs="Arial"/>
+                <w:i w:val="false"/>
+                <w:b w:val="false"/>
+                <w:u w:val="none"/>
+                <w:sz w:val="18"/>
+                <w:szCs w:val="18"/>
+                <w:color w:val="000000"/>
+              </w:rPr>
+            </w:pPr>
+            <w:r>
+              <w:rPr>
+                <w:rFonts w:ascii="Arial" w:hAnsi="Arial" w:eastAsia="Arial" w:cs="Arial"/>
+                <w:i w:val="false"/>
+                <w:b w:val="false"/>
+                <w:u w:val="none"/>
+                <w:sz w:val="18"/>
+                <w:szCs w:val="18"/>
+                <w:color w:val="000000"/>
+              </w:rPr>
+              <w:t xml:space="preserve">1 (25.0%)</w:t>
             </w:r>
           </w:p>
         </w:tc>
@@ -8723,59 +8723,59 @@
                 <w:szCs w:val="18"/>
                 <w:color w:val="000000"/>
               </w:rPr>
-              <w:t xml:space="preserve">1 (20.0%)</w:t>
-            </w:r>
-          </w:p>
-        </w:tc>
-        <w:tc>
-          <w:tcPr>
-            <w:tcBorders>
-              <w:bottom w:val="none" w:sz="0" w:space="0" w:color="000000"/>
-              <w:top w:val="none" w:sz="0" w:space="0" w:color="000000"/>
-              <w:left w:val="none" w:sz="0" w:space="0" w:color="000000"/>
-              <w:right w:val="none" w:sz="0" w:space="0" w:color="000000"/>
-            </w:tcBorders>
-            <w:shd w:val="clear" w:color="auto" w:fill="FFFFFF"/>
-            <w:tcMar>
-              <w:top w:w="0" w:type="dxa"/>
-              <w:bottom w:w="0" w:type="dxa"/>
-              <w:left w:w="0" w:type="dxa"/>
-              <w:right w:w="0" w:type="dxa"/>
-            </w:tcMar>
-            <w:vAlign w:val="center"/>
-          </w:tcPr>
-          <w:p>
-            <w:pPr>
-              <w:jc w:val="left"/>
-              <w:pBdr>
-                <w:bottom w:val="none" w:sz="0" w:space="0" w:color="000000"/>
-                <w:top w:val="none" w:sz="0" w:space="0" w:color="000000"/>
-                <w:left w:val="none" w:sz="0" w:space="0" w:color="000000"/>
-                <w:right w:val="none" w:sz="0" w:space="0" w:color="000000"/>
-              </w:pBdr>
-              <w:spacing w:after="100" w:before="100" w:line="240"/>
-              <w:ind w:left="100" w:right="100" w:firstLine="0" w:firstLineChars="0"/>
-              <w:rPr>
-                <w:rFonts w:ascii="Arial" w:hAnsi="Arial" w:eastAsia="Arial" w:cs="Arial"/>
-                <w:i w:val="false"/>
-                <w:b w:val="false"/>
-                <w:u w:val="none"/>
-                <w:sz w:val="18"/>
-                <w:szCs w:val="18"/>
-                <w:color w:val="000000"/>
-              </w:rPr>
-            </w:pPr>
-            <w:r>
-              <w:rPr>
-                <w:rFonts w:ascii="Arial" w:hAnsi="Arial" w:eastAsia="Arial" w:cs="Arial"/>
-                <w:i w:val="false"/>
-                <w:b w:val="false"/>
-                <w:u w:val="none"/>
-                <w:sz w:val="18"/>
-                <w:szCs w:val="18"/>
-                <w:color w:val="000000"/>
-              </w:rPr>
-              <w:t xml:space="preserve">4 (80.0%)</w:t>
+              <w:t xml:space="preserve">1 (25.0%)</w:t>
+            </w:r>
+          </w:p>
+        </w:tc>
+        <w:tc>
+          <w:tcPr>
+            <w:tcBorders>
+              <w:bottom w:val="none" w:sz="0" w:space="0" w:color="000000"/>
+              <w:top w:val="none" w:sz="0" w:space="0" w:color="000000"/>
+              <w:left w:val="none" w:sz="0" w:space="0" w:color="000000"/>
+              <w:right w:val="none" w:sz="0" w:space="0" w:color="000000"/>
+            </w:tcBorders>
+            <w:shd w:val="clear" w:color="auto" w:fill="FFFFFF"/>
+            <w:tcMar>
+              <w:top w:w="0" w:type="dxa"/>
+              <w:bottom w:w="0" w:type="dxa"/>
+              <w:left w:w="0" w:type="dxa"/>
+              <w:right w:w="0" w:type="dxa"/>
+            </w:tcMar>
+            <w:vAlign w:val="center"/>
+          </w:tcPr>
+          <w:p>
+            <w:pPr>
+              <w:jc w:val="left"/>
+              <w:pBdr>
+                <w:bottom w:val="none" w:sz="0" w:space="0" w:color="000000"/>
+                <w:top w:val="none" w:sz="0" w:space="0" w:color="000000"/>
+                <w:left w:val="none" w:sz="0" w:space="0" w:color="000000"/>
+                <w:right w:val="none" w:sz="0" w:space="0" w:color="000000"/>
+              </w:pBdr>
+              <w:spacing w:after="100" w:before="100" w:line="240"/>
+              <w:ind w:left="100" w:right="100" w:firstLine="0" w:firstLineChars="0"/>
+              <w:rPr>
+                <w:rFonts w:ascii="Arial" w:hAnsi="Arial" w:eastAsia="Arial" w:cs="Arial"/>
+                <w:i w:val="false"/>
+                <w:b w:val="false"/>
+                <w:u w:val="none"/>
+                <w:sz w:val="18"/>
+                <w:szCs w:val="18"/>
+                <w:color w:val="000000"/>
+              </w:rPr>
+            </w:pPr>
+            <w:r>
+              <w:rPr>
+                <w:rFonts w:ascii="Arial" w:hAnsi="Arial" w:eastAsia="Arial" w:cs="Arial"/>
+                <w:i w:val="false"/>
+                <w:b w:val="false"/>
+                <w:u w:val="none"/>
+                <w:sz w:val="18"/>
+                <w:szCs w:val="18"/>
+                <w:color w:val="000000"/>
+              </w:rPr>
+              <w:t xml:space="preserve">3 (75.0%)</w:t>
             </w:r>
           </w:p>
         </w:tc>
@@ -9041,7 +9041,7 @@
                 <w:szCs w:val="18"/>
                 <w:color w:val="000000"/>
               </w:rPr>
-              <w:t xml:space="preserve">5 (100.0%)</w:t>
+              <w:t xml:space="preserve">4 (100.0%)</w:t>
             </w:r>
           </w:p>
         </w:tc>

</xml_diff>